<commit_message>
fix, al intentar cargar notas con el pefil profesor, a veces no se guardaban las notas, solucionado
</commit_message>
<xml_diff>
--- a/Manual_de_Uso_SysEqui.docx
+++ b/Manual_de_Uso_SysEqui.docx
@@ -94,12 +94,6 @@
         <w:gridCol w:w="5028"/>
       </w:tblGrid>
       <w:tr>
-        <w:tblPrEx>
-          <w:tblCellMar>
-            <w:top w:w="0" w:type="dxa"/>
-            <w:bottom w:w="0" w:type="dxa"/>
-          </w:tblCellMar>
-        </w:tblPrEx>
         <w:trPr>
           <w:jc w:val="center"/>
         </w:trPr>
@@ -152,12 +146,6 @@
         </w:tc>
       </w:tr>
       <w:tr>
-        <w:tblPrEx>
-          <w:tblCellMar>
-            <w:top w:w="0" w:type="dxa"/>
-            <w:bottom w:w="0" w:type="dxa"/>
-          </w:tblCellMar>
-        </w:tblPrEx>
         <w:trPr>
           <w:jc w:val="center"/>
         </w:trPr>
@@ -210,12 +198,6 @@
         </w:tc>
       </w:tr>
       <w:tr>
-        <w:tblPrEx>
-          <w:tblCellMar>
-            <w:top w:w="0" w:type="dxa"/>
-            <w:bottom w:w="0" w:type="dxa"/>
-          </w:tblCellMar>
-        </w:tblPrEx>
         <w:trPr>
           <w:jc w:val="center"/>
         </w:trPr>
@@ -268,12 +250,6 @@
         </w:tc>
       </w:tr>
       <w:tr>
-        <w:tblPrEx>
-          <w:tblCellMar>
-            <w:top w:w="0" w:type="dxa"/>
-            <w:bottom w:w="0" w:type="dxa"/>
-          </w:tblCellMar>
-        </w:tblPrEx>
         <w:trPr>
           <w:jc w:val="center"/>
         </w:trPr>
@@ -326,12 +302,6 @@
         </w:tc>
       </w:tr>
       <w:tr>
-        <w:tblPrEx>
-          <w:tblCellMar>
-            <w:top w:w="0" w:type="dxa"/>
-            <w:bottom w:w="0" w:type="dxa"/>
-          </w:tblCellMar>
-        </w:tblPrEx>
         <w:trPr>
           <w:jc w:val="center"/>
         </w:trPr>
@@ -384,12 +354,6 @@
         </w:tc>
       </w:tr>
       <w:tr>
-        <w:tblPrEx>
-          <w:tblCellMar>
-            <w:top w:w="0" w:type="dxa"/>
-            <w:bottom w:w="0" w:type="dxa"/>
-          </w:tblCellMar>
-        </w:tblPrEx>
         <w:trPr>
           <w:jc w:val="center"/>
         </w:trPr>
@@ -442,12 +406,6 @@
         </w:tc>
       </w:tr>
       <w:tr>
-        <w:tblPrEx>
-          <w:tblCellMar>
-            <w:top w:w="0" w:type="dxa"/>
-            <w:bottom w:w="0" w:type="dxa"/>
-          </w:tblCellMar>
-        </w:tblPrEx>
         <w:trPr>
           <w:jc w:val="center"/>
         </w:trPr>
@@ -515,25 +473,7 @@
           <w:sz w:val="19"/>
           <w:szCs w:val="19"/>
         </w:rPr>
-        <w:t xml:space="preserve">Versión </w:t>
-      </w:r>
-      <w:proofErr w:type="gramStart"/>
-      <w:r>
-        <w:rPr>
-          <w:color w:val="595959"/>
-          <w:sz w:val="19"/>
-          <w:szCs w:val="19"/>
-        </w:rPr>
-        <w:t>1.0  •</w:t>
-      </w:r>
-      <w:proofErr w:type="gramEnd"/>
-      <w:r>
-        <w:rPr>
-          <w:color w:val="595959"/>
-          <w:sz w:val="19"/>
-          <w:szCs w:val="19"/>
-        </w:rPr>
-        <w:t xml:space="preserve">  Julio de 2026</w:t>
+        <w:t>Versión 1.0  •  Julio de 2026</w:t>
       </w:r>
     </w:p>
     <w:p>
@@ -564,12 +504,6 @@
         <w:gridCol w:w="5326"/>
       </w:tblGrid>
       <w:tr>
-        <w:tblPrEx>
-          <w:tblCellMar>
-            <w:top w:w="0" w:type="dxa"/>
-            <w:bottom w:w="0" w:type="dxa"/>
-          </w:tblCellMar>
-        </w:tblPrEx>
         <w:trPr>
           <w:jc w:val="center"/>
         </w:trPr>
@@ -3539,50 +3473,6 @@
                 <w:rStyle w:val="Hipervnculo"/>
                 <w:noProof/>
               </w:rPr>
-              <w:drawing>
-                <wp:inline distT="0" distB="0" distL="0" distR="0" wp14:anchorId="11AB858D" wp14:editId="7C2F3A27">
-                  <wp:extent cx="2476500" cy="2476500"/>
-                  <wp:effectExtent l="0" t="0" r="0" b="0"/>
-                  <wp:docPr id="4" name="Imagen 4"/>
-                  <wp:cNvGraphicFramePr>
-                    <a:graphicFrameLocks xmlns:a="http://schemas.openxmlformats.org/drawingml/2006/main" noChangeAspect="1"/>
-                  </wp:cNvGraphicFramePr>
-                  <a:graphic xmlns:a="http://schemas.openxmlformats.org/drawingml/2006/main">
-                    <a:graphicData uri="http://schemas.openxmlformats.org/drawingml/2006/picture">
-                      <pic:pic xmlns:pic="http://schemas.openxmlformats.org/drawingml/2006/picture">
-                        <pic:nvPicPr>
-                          <pic:cNvPr id="0" name=""/>
-                          <pic:cNvPicPr>
-                            <a:picLocks noChangeAspect="1" noChangeArrowheads="1"/>
-                          </pic:cNvPicPr>
-                        </pic:nvPicPr>
-                        <pic:blipFill>
-                          <a:blip r:embed="rId7"/>
-                          <a:srcRect/>
-                          <a:stretch>
-                            <a:fillRect/>
-                          </a:stretch>
-                        </pic:blipFill>
-                        <pic:spPr bwMode="auto">
-                          <a:xfrm>
-                            <a:off x="0" y="0"/>
-                            <a:ext cx="2476500" cy="2476500"/>
-                          </a:xfrm>
-                          <a:prstGeom prst="rect">
-                            <a:avLst/>
-                          </a:prstGeom>
-                        </pic:spPr>
-                      </pic:pic>
-                    </a:graphicData>
-                  </a:graphic>
-                </wp:inline>
-              </w:drawing>
-            </w:r>
-            <w:r>
-              <w:rPr>
-                <w:rStyle w:val="Hipervnculo"/>
-                <w:noProof/>
-              </w:rPr>
               <w:t xml:space="preserve">   8.2 Alternativa: instalación local</w:t>
             </w:r>
             <w:r>
@@ -4850,7 +4740,6 @@
         </w:p>
         <w:p>
           <w:r>
-            <w:lastRenderedPageBreak/>
             <w:fldChar w:fldCharType="end"/>
           </w:r>
         </w:p>
@@ -4989,13 +4878,7 @@
         <w:rPr>
           <w:color w:val="1A1A1A"/>
         </w:rPr>
-        <w:t xml:space="preserve"> es una aplicación web destinada a organizar y automatizar la gestión de equivalencias de materias. Centraliza alumnos, docentes, cursos, materias, notas y solicitudes </w:t>
-      </w:r>
-      <w:r>
-        <w:rPr>
-          <w:color w:val="1A1A1A"/>
-        </w:rPr>
-        <w:t>en un único entorno.</w:t>
+        <w:t xml:space="preserve"> es una aplicación web destinada a organizar y automatizar la gestión de equivalencias de materias. Centraliza alumnos, docentes, cursos, materias, notas y solicitudes en un único entorno.</w:t>
       </w:r>
     </w:p>
     <w:p>
@@ -5052,12 +4935,6 @@
         <w:gridCol w:w="6826"/>
       </w:tblGrid>
       <w:tr>
-        <w:tblPrEx>
-          <w:tblCellMar>
-            <w:top w:w="0" w:type="dxa"/>
-            <w:bottom w:w="0" w:type="dxa"/>
-          </w:tblCellMar>
-        </w:tblPrEx>
         <w:trPr>
           <w:tblHeader/>
         </w:trPr>
@@ -5113,12 +4990,6 @@
         </w:tc>
       </w:tr>
       <w:tr>
-        <w:tblPrEx>
-          <w:tblCellMar>
-            <w:top w:w="0" w:type="dxa"/>
-            <w:bottom w:w="0" w:type="dxa"/>
-          </w:tblCellMar>
-        </w:tblPrEx>
         <w:tc>
           <w:tcPr>
             <w:tcW w:w="1400" w:type="pct"/>
@@ -5193,12 +5064,6 @@
         </w:tc>
       </w:tr>
       <w:tr>
-        <w:tblPrEx>
-          <w:tblCellMar>
-            <w:top w:w="0" w:type="dxa"/>
-            <w:bottom w:w="0" w:type="dxa"/>
-          </w:tblCellMar>
-        </w:tblPrEx>
         <w:tc>
           <w:tcPr>
             <w:tcW w:w="1400" w:type="pct"/>
@@ -5255,12 +5120,6 @@
         </w:tc>
       </w:tr>
       <w:tr>
-        <w:tblPrEx>
-          <w:tblCellMar>
-            <w:top w:w="0" w:type="dxa"/>
-            <w:bottom w:w="0" w:type="dxa"/>
-          </w:tblCellMar>
-        </w:tblPrEx>
         <w:tc>
           <w:tcPr>
             <w:tcW w:w="1400" w:type="pct"/>
@@ -5315,12 +5174,6 @@
         </w:tc>
       </w:tr>
       <w:tr>
-        <w:tblPrEx>
-          <w:tblCellMar>
-            <w:top w:w="0" w:type="dxa"/>
-            <w:bottom w:w="0" w:type="dxa"/>
-          </w:tblCellMar>
-        </w:tblPrEx>
         <w:tc>
           <w:tcPr>
             <w:tcW w:w="1400" w:type="pct"/>
@@ -5375,12 +5228,6 @@
         </w:tc>
       </w:tr>
       <w:tr>
-        <w:tblPrEx>
-          <w:tblCellMar>
-            <w:top w:w="0" w:type="dxa"/>
-            <w:bottom w:w="0" w:type="dxa"/>
-          </w:tblCellMar>
-        </w:tblPrEx>
         <w:tc>
           <w:tcPr>
             <w:tcW w:w="1400" w:type="pct"/>
@@ -5442,130 +5289,6 @@
         <w:spacing w:after="180"/>
       </w:pPr>
     </w:p>
-    <w:tbl>
-      <w:tblPr>
-        <w:tblW w:w="5000" w:type="pct"/>
-        <w:tblBorders>
-          <w:top w:val="single" w:sz="6" w:space="0" w:color="B7B7B7"/>
-          <w:left w:val="single" w:sz="24" w:space="0" w:color="2E5395"/>
-          <w:bottom w:val="single" w:sz="6" w:space="0" w:color="B7B7B7"/>
-          <w:right w:val="single" w:sz="6" w:space="0" w:color="B7B7B7"/>
-          <w:insideH w:val="single" w:sz="6" w:space="0" w:color="B7B7B7"/>
-          <w:insideV w:val="single" w:sz="6" w:space="0" w:color="B7B7B7"/>
-        </w:tblBorders>
-        <w:tblCellMar>
-          <w:left w:w="10" w:type="dxa"/>
-          <w:right w:w="10" w:type="dxa"/>
-        </w:tblCellMar>
-        <w:tblLook w:val="04A0" w:firstRow="1" w:lastRow="0" w:firstColumn="1" w:lastColumn="0" w:noHBand="0" w:noVBand="1"/>
-      </w:tblPr>
-      <w:tblGrid>
-        <w:gridCol w:w="9458"/>
-      </w:tblGrid>
-      <w:tr>
-        <w:tblPrEx>
-          <w:tblCellMar>
-            <w:top w:w="0" w:type="dxa"/>
-            <w:bottom w:w="0" w:type="dxa"/>
-          </w:tblCellMar>
-        </w:tblPrEx>
-        <w:tc>
-          <w:tcPr>
-            <w:tcW w:w="0" w:type="auto"/>
-            <w:shd w:val="clear" w:color="auto" w:fill="FFFFFF"/>
-            <w:tcMar>
-              <w:top w:w="140" w:type="dxa"/>
-              <w:left w:w="240" w:type="dxa"/>
-              <w:bottom w:w="160" w:type="dxa"/>
-              <w:right w:w="240" w:type="dxa"/>
-            </w:tcMar>
-          </w:tcPr>
-          <w:p>
-            <w:pPr>
-              <w:spacing w:after="60"/>
-            </w:pPr>
-            <w:r>
-              <w:rPr>
-                <w:b/>
-                <w:bCs/>
-                <w:color w:val="2E5395"/>
-                <w:sz w:val="20"/>
-                <w:szCs w:val="20"/>
-              </w:rPr>
-              <w:t>IDEA CLAVE</w:t>
-            </w:r>
-          </w:p>
-          <w:p>
-            <w:pPr>
-              <w:spacing w:line="264" w:lineRule="auto"/>
-              <w:jc w:val="both"/>
-            </w:pPr>
-            <w:r>
-              <w:rPr>
-                <w:color w:val="1A1A1A"/>
-                <w:sz w:val="20"/>
-                <w:szCs w:val="20"/>
-              </w:rPr>
-              <w:t xml:space="preserve">Para usar </w:t>
-            </w:r>
-            <w:proofErr w:type="spellStart"/>
-            <w:r>
-              <w:rPr>
-                <w:color w:val="1A1A1A"/>
-                <w:sz w:val="20"/>
-                <w:szCs w:val="20"/>
-              </w:rPr>
-              <w:t>SysEqui</w:t>
-            </w:r>
-            <w:proofErr w:type="spellEnd"/>
-            <w:r>
-              <w:rPr>
-                <w:color w:val="1A1A1A"/>
-                <w:sz w:val="20"/>
-                <w:szCs w:val="20"/>
-              </w:rPr>
-              <w:t xml:space="preserve"> deben estar activos, como mínimo, MongoDB, el </w:t>
-            </w:r>
-            <w:proofErr w:type="spellStart"/>
-            <w:r>
-              <w:rPr>
-                <w:color w:val="1A1A1A"/>
-                <w:sz w:val="20"/>
-                <w:szCs w:val="20"/>
-              </w:rPr>
-              <w:t>backend</w:t>
-            </w:r>
-            <w:proofErr w:type="spellEnd"/>
-            <w:r>
-              <w:rPr>
-                <w:color w:val="1A1A1A"/>
-                <w:sz w:val="20"/>
-                <w:szCs w:val="20"/>
-              </w:rPr>
-              <w:t xml:space="preserve"> y el </w:t>
-            </w:r>
-            <w:proofErr w:type="spellStart"/>
-            <w:r>
-              <w:rPr>
-                <w:color w:val="1A1A1A"/>
-                <w:sz w:val="20"/>
-                <w:szCs w:val="20"/>
-              </w:rPr>
-              <w:t>frontend</w:t>
-            </w:r>
-            <w:proofErr w:type="spellEnd"/>
-            <w:r>
-              <w:rPr>
-                <w:color w:val="1A1A1A"/>
-                <w:sz w:val="20"/>
-                <w:szCs w:val="20"/>
-              </w:rPr>
-              <w:t>.</w:t>
-            </w:r>
-          </w:p>
-        </w:tc>
-      </w:tr>
-    </w:tbl>
     <w:p>
       <w:pPr>
         <w:spacing w:after="180"/>
@@ -5603,12 +5326,6 @@
         <w:gridCol w:w="7394"/>
       </w:tblGrid>
       <w:tr>
-        <w:tblPrEx>
-          <w:tblCellMar>
-            <w:top w:w="0" w:type="dxa"/>
-            <w:bottom w:w="0" w:type="dxa"/>
-          </w:tblCellMar>
-        </w:tblPrEx>
         <w:trPr>
           <w:tblHeader/>
         </w:trPr>
@@ -5664,12 +5381,6 @@
         </w:tc>
       </w:tr>
       <w:tr>
-        <w:tblPrEx>
-          <w:tblCellMar>
-            <w:top w:w="0" w:type="dxa"/>
-            <w:bottom w:w="0" w:type="dxa"/>
-          </w:tblCellMar>
-        </w:tblPrEx>
         <w:tc>
           <w:tcPr>
             <w:tcW w:w="1100" w:type="pct"/>
@@ -5724,12 +5435,6 @@
         </w:tc>
       </w:tr>
       <w:tr>
-        <w:tblPrEx>
-          <w:tblCellMar>
-            <w:top w:w="0" w:type="dxa"/>
-            <w:bottom w:w="0" w:type="dxa"/>
-          </w:tblCellMar>
-        </w:tblPrEx>
         <w:tc>
           <w:tcPr>
             <w:tcW w:w="1100" w:type="pct"/>
@@ -5784,12 +5489,6 @@
         </w:tc>
       </w:tr>
       <w:tr>
-        <w:tblPrEx>
-          <w:tblCellMar>
-            <w:top w:w="0" w:type="dxa"/>
-            <w:bottom w:w="0" w:type="dxa"/>
-          </w:tblCellMar>
-        </w:tblPrEx>
         <w:tc>
           <w:tcPr>
             <w:tcW w:w="1100" w:type="pct"/>
@@ -5844,12 +5543,6 @@
         </w:tc>
       </w:tr>
       <w:tr>
-        <w:tblPrEx>
-          <w:tblCellMar>
-            <w:top w:w="0" w:type="dxa"/>
-            <w:bottom w:w="0" w:type="dxa"/>
-          </w:tblCellMar>
-        </w:tblPrEx>
         <w:tc>
           <w:tcPr>
             <w:tcW w:w="1100" w:type="pct"/>
@@ -5931,6 +5624,38 @@
     </w:p>
     <w:p>
       <w:pPr>
+        <w:spacing w:after="160" w:line="276" w:lineRule="auto"/>
+        <w:jc w:val="both"/>
+      </w:pPr>
+      <w:r>
+        <w:rPr>
+          <w:color w:val="1A1A1A"/>
+        </w:rPr>
+        <w:t xml:space="preserve">Si está registrado en </w:t>
+      </w:r>
+      <w:proofErr w:type="spellStart"/>
+      <w:r>
+        <w:rPr>
+          <w:color w:val="1A1A1A"/>
+        </w:rPr>
+        <w:t>SysEqui</w:t>
+      </w:r>
+      <w:proofErr w:type="spellEnd"/>
+      <w:r>
+        <w:rPr>
+          <w:color w:val="1A1A1A"/>
+        </w:rPr>
+        <w:t xml:space="preserve"> debe loquearse para acceder a su cuenta</w:t>
+      </w:r>
+      <w:r>
+        <w:rPr>
+          <w:color w:val="1A1A1A"/>
+        </w:rPr>
+        <w:t>.</w:t>
+      </w:r>
+    </w:p>
+    <w:p>
+      <w:pPr>
         <w:tabs>
           <w:tab w:val="left" w:pos="420"/>
         </w:tabs>
@@ -5948,7 +5673,20 @@
       </w:r>
       <w:r>
         <w:tab/>
-        <w:t>Abra http://localhost:5173.</w:t>
+      </w:r>
+      <w:r>
+        <w:t xml:space="preserve">En su navegador (Chrome, Brave, </w:t>
+      </w:r>
+      <w:proofErr w:type="spellStart"/>
+      <w:r>
+        <w:t>etc</w:t>
+      </w:r>
+      <w:proofErr w:type="spellEnd"/>
+      <w:r>
+        <w:t xml:space="preserve">) vaya </w:t>
+      </w:r>
+      <w:r>
+        <w:t>a http://localhost:5173.</w:t>
       </w:r>
     </w:p>
     <w:p>
@@ -6014,18 +5752,329 @@
       </w:r>
       <w:r>
         <w:tab/>
-      </w:r>
-      <w:r>
         <w:t>Seleccione «Ingresar».</w:t>
       </w:r>
     </w:p>
     <w:p>
       <w:pPr>
-        <w:spacing w:after="140"/>
+        <w:tabs>
+          <w:tab w:val="left" w:pos="420"/>
+        </w:tabs>
+        <w:spacing w:after="100" w:line="270" w:lineRule="auto"/>
+        <w:ind w:left="420" w:hanging="420"/>
+        <w:jc w:val="both"/>
+      </w:pPr>
+    </w:p>
+    <w:p>
+      <w:pPr>
+        <w:pStyle w:val="Ttulo2"/>
+      </w:pPr>
+      <w:bookmarkStart w:id="7" w:name="_Toc236169216"/>
+      <w:r>
+        <w:t>8.2 Registrar un alumno</w:t>
+      </w:r>
+      <w:bookmarkEnd w:id="7"/>
+    </w:p>
+    <w:p>
+      <w:pPr>
+        <w:spacing w:after="160" w:line="276" w:lineRule="auto"/>
+        <w:jc w:val="both"/>
+        <w:rPr>
+          <w:color w:val="1A1A1A"/>
+        </w:rPr>
+      </w:pPr>
+      <w:r>
+        <w:rPr>
+          <w:color w:val="1A1A1A"/>
+        </w:rPr>
+        <w:t xml:space="preserve">Si no es un usuario ya registrado en </w:t>
+      </w:r>
+      <w:proofErr w:type="spellStart"/>
+      <w:r>
+        <w:rPr>
+          <w:color w:val="1A1A1A"/>
+        </w:rPr>
+        <w:t>SysEquid</w:t>
+      </w:r>
+      <w:proofErr w:type="spellEnd"/>
+      <w:r>
+        <w:rPr>
+          <w:color w:val="1A1A1A"/>
+        </w:rPr>
+        <w:t xml:space="preserve">, debe registrarse </w:t>
+      </w:r>
+      <w:r>
+        <w:rPr>
+          <w:color w:val="1A1A1A"/>
+        </w:rPr>
+        <w:t>d</w:t>
+      </w:r>
+      <w:r>
+        <w:rPr>
+          <w:color w:val="1A1A1A"/>
+        </w:rPr>
+        <w:t>esde «</w:t>
+      </w:r>
+      <w:r>
+        <w:rPr>
+          <w:b/>
+          <w:bCs/>
+          <w:color w:val="1A1A1A"/>
+        </w:rPr>
+        <w:t>Registrarse</w:t>
+      </w:r>
+      <w:r>
+        <w:rPr>
+          <w:color w:val="1A1A1A"/>
+        </w:rPr>
+        <w:t>», complete nombre, apellido, DNI, teléfono, correo y contraseña. La cuenta quedará pendiente hasta que un administrador la valide.</w:t>
+      </w:r>
+    </w:p>
+    <w:p>
+      <w:pPr>
+        <w:spacing w:after="160" w:line="276" w:lineRule="auto"/>
+        <w:jc w:val="both"/>
+      </w:pPr>
+      <w:r>
+        <w:drawing>
+          <wp:inline distT="0" distB="0" distL="0" distR="0" wp14:anchorId="4FD59CAC" wp14:editId="6504B4E8">
+            <wp:extent cx="6029960" cy="3332480"/>
+            <wp:effectExtent l="0" t="0" r="8890" b="1270"/>
+            <wp:docPr id="5" name="Imagen 5"/>
+            <wp:cNvGraphicFramePr>
+              <a:graphicFrameLocks xmlns:a="http://schemas.openxmlformats.org/drawingml/2006/main" noChangeAspect="1"/>
+            </wp:cNvGraphicFramePr>
+            <a:graphic xmlns:a="http://schemas.openxmlformats.org/drawingml/2006/main">
+              <a:graphicData uri="http://schemas.openxmlformats.org/drawingml/2006/picture">
+                <pic:pic xmlns:pic="http://schemas.openxmlformats.org/drawingml/2006/picture">
+                  <pic:nvPicPr>
+                    <pic:cNvPr id="1" name=""/>
+                    <pic:cNvPicPr/>
+                  </pic:nvPicPr>
+                  <pic:blipFill>
+                    <a:blip r:embed="rId7"/>
+                    <a:stretch>
+                      <a:fillRect/>
+                    </a:stretch>
+                  </pic:blipFill>
+                  <pic:spPr>
+                    <a:xfrm>
+                      <a:off x="0" y="0"/>
+                      <a:ext cx="6029960" cy="3332480"/>
+                    </a:xfrm>
+                    <a:prstGeom prst="rect">
+                      <a:avLst/>
+                    </a:prstGeom>
+                  </pic:spPr>
+                </pic:pic>
+              </a:graphicData>
+            </a:graphic>
+          </wp:inline>
+        </w:drawing>
+      </w:r>
+    </w:p>
+    <w:p>
+      <w:pPr>
+        <w:spacing w:after="160" w:line="276" w:lineRule="auto"/>
+        <w:jc w:val="center"/>
+      </w:pPr>
+      <w:r>
+        <w:rPr>
+          <w:i/>
+          <w:iCs/>
+          <w:color w:val="8C8C8C"/>
+          <w:sz w:val="18"/>
+          <w:szCs w:val="18"/>
+        </w:rPr>
+        <w:t xml:space="preserve">Figura </w:t>
+      </w:r>
+      <w:r>
+        <w:rPr>
+          <w:i/>
+          <w:iCs/>
+          <w:color w:val="8C8C8C"/>
+          <w:sz w:val="18"/>
+          <w:szCs w:val="18"/>
+        </w:rPr>
+        <w:t>4</w:t>
+      </w:r>
+      <w:r>
+        <w:rPr>
+          <w:i/>
+          <w:iCs/>
+          <w:color w:val="8C8C8C"/>
+          <w:sz w:val="18"/>
+          <w:szCs w:val="18"/>
+        </w:rPr>
+        <w:t xml:space="preserve">. </w:t>
+      </w:r>
+      <w:r>
+        <w:rPr>
+          <w:i/>
+          <w:iCs/>
+          <w:color w:val="8C8C8C"/>
+          <w:sz w:val="18"/>
+          <w:szCs w:val="18"/>
+        </w:rPr>
+        <w:t xml:space="preserve">Pantalla de </w:t>
+      </w:r>
+      <w:proofErr w:type="spellStart"/>
+      <w:r>
+        <w:rPr>
+          <w:i/>
+          <w:iCs/>
+          <w:color w:val="8C8C8C"/>
+          <w:sz w:val="18"/>
+          <w:szCs w:val="18"/>
+        </w:rPr>
+        <w:t>login</w:t>
+      </w:r>
+      <w:proofErr w:type="spellEnd"/>
+      <w:r>
+        <w:rPr>
+          <w:i/>
+          <w:iCs/>
+          <w:color w:val="8C8C8C"/>
+          <w:sz w:val="18"/>
+          <w:szCs w:val="18"/>
+        </w:rPr>
+        <w:t>.</w:t>
+      </w:r>
+    </w:p>
+    <w:p>
+      <w:pPr>
+        <w:spacing w:after="160" w:line="276" w:lineRule="auto"/>
+        <w:jc w:val="both"/>
       </w:pPr>
     </w:p>
     <w:tbl>
       <w:tblPr>
+        <w:tblpPr w:leftFromText="141" w:rightFromText="141" w:vertAnchor="text" w:horzAnchor="margin" w:tblpY="68"/>
+        <w:tblW w:w="5000" w:type="pct"/>
+        <w:tblBorders>
+          <w:top w:val="single" w:sz="6" w:space="0" w:color="B7B7B7"/>
+          <w:left w:val="single" w:sz="24" w:space="0" w:color="2E5395"/>
+          <w:bottom w:val="single" w:sz="6" w:space="0" w:color="B7B7B7"/>
+          <w:right w:val="single" w:sz="6" w:space="0" w:color="B7B7B7"/>
+          <w:insideH w:val="single" w:sz="6" w:space="0" w:color="B7B7B7"/>
+          <w:insideV w:val="single" w:sz="6" w:space="0" w:color="B7B7B7"/>
+        </w:tblBorders>
+        <w:tblCellMar>
+          <w:left w:w="10" w:type="dxa"/>
+          <w:right w:w="10" w:type="dxa"/>
+        </w:tblCellMar>
+        <w:tblLook w:val="04A0" w:firstRow="1" w:lastRow="0" w:firstColumn="1" w:lastColumn="0" w:noHBand="0" w:noVBand="1"/>
+      </w:tblPr>
+      <w:tblGrid>
+        <w:gridCol w:w="9458"/>
+      </w:tblGrid>
+      <w:tr>
+        <w:tc>
+          <w:tcPr>
+            <w:tcW w:w="0" w:type="auto"/>
+            <w:shd w:val="clear" w:color="auto" w:fill="FFFFFF"/>
+            <w:tcMar>
+              <w:top w:w="140" w:type="dxa"/>
+              <w:left w:w="240" w:type="dxa"/>
+              <w:bottom w:w="160" w:type="dxa"/>
+              <w:right w:w="240" w:type="dxa"/>
+            </w:tcMar>
+          </w:tcPr>
+          <w:p>
+            <w:pPr>
+              <w:spacing w:after="60"/>
+            </w:pPr>
+            <w:r>
+              <w:rPr>
+                <w:b/>
+                <w:bCs/>
+                <w:color w:val="2E5395"/>
+                <w:sz w:val="20"/>
+                <w:szCs w:val="20"/>
+              </w:rPr>
+              <w:t>IDEA CLAVE</w:t>
+            </w:r>
+          </w:p>
+          <w:p>
+            <w:pPr>
+              <w:spacing w:line="264" w:lineRule="auto"/>
+              <w:jc w:val="both"/>
+            </w:pPr>
+            <w:r>
+              <w:rPr>
+                <w:color w:val="1A1A1A"/>
+                <w:sz w:val="20"/>
+                <w:szCs w:val="20"/>
+              </w:rPr>
+              <w:t xml:space="preserve">Para usar todas las funciones de  </w:t>
+            </w:r>
+            <w:proofErr w:type="spellStart"/>
+            <w:r>
+              <w:rPr>
+                <w:color w:val="1A1A1A"/>
+                <w:sz w:val="20"/>
+                <w:szCs w:val="20"/>
+              </w:rPr>
+              <w:t>SysEqui</w:t>
+            </w:r>
+            <w:proofErr w:type="spellEnd"/>
+            <w:r>
+              <w:rPr>
+                <w:color w:val="1A1A1A"/>
+                <w:sz w:val="20"/>
+                <w:szCs w:val="20"/>
+              </w:rPr>
+              <w:t xml:space="preserve"> deben estar activos, , MongoDB, el </w:t>
+            </w:r>
+            <w:proofErr w:type="spellStart"/>
+            <w:r>
+              <w:rPr>
+                <w:color w:val="1A1A1A"/>
+                <w:sz w:val="20"/>
+                <w:szCs w:val="20"/>
+              </w:rPr>
+              <w:t>backend</w:t>
+            </w:r>
+            <w:proofErr w:type="spellEnd"/>
+            <w:r>
+              <w:rPr>
+                <w:color w:val="1A1A1A"/>
+                <w:sz w:val="20"/>
+                <w:szCs w:val="20"/>
+              </w:rPr>
+              <w:t xml:space="preserve"> y el </w:t>
+            </w:r>
+            <w:proofErr w:type="spellStart"/>
+            <w:r>
+              <w:rPr>
+                <w:color w:val="1A1A1A"/>
+                <w:sz w:val="20"/>
+                <w:szCs w:val="20"/>
+              </w:rPr>
+              <w:t>frontend</w:t>
+            </w:r>
+            <w:proofErr w:type="spellEnd"/>
+            <w:r>
+              <w:rPr>
+                <w:color w:val="1A1A1A"/>
+                <w:sz w:val="20"/>
+                <w:szCs w:val="20"/>
+              </w:rPr>
+              <w:t>.</w:t>
+            </w:r>
+          </w:p>
+        </w:tc>
+      </w:tr>
+    </w:tbl>
+    <w:p>
+      <w:pPr>
+        <w:spacing w:after="160" w:line="276" w:lineRule="auto"/>
+        <w:jc w:val="both"/>
+      </w:pPr>
+    </w:p>
+    <w:tbl>
+      <w:tblPr>
+        <w:tblpPr w:leftFromText="141" w:rightFromText="141" w:vertAnchor="text" w:horzAnchor="margin" w:tblpY="78"/>
         <w:tblW w:w="5000" w:type="pct"/>
         <w:tblBorders>
           <w:top w:val="single" w:sz="6" w:space="0" w:color="B7B7B7"/>
@@ -6045,12 +6094,6 @@
         <w:gridCol w:w="9458"/>
       </w:tblGrid>
       <w:tr>
-        <w:tblPrEx>
-          <w:tblCellMar>
-            <w:top w:w="0" w:type="dxa"/>
-            <w:bottom w:w="0" w:type="dxa"/>
-          </w:tblCellMar>
-        </w:tblPrEx>
         <w:tc>
           <w:tcPr>
             <w:tcW w:w="0" w:type="auto"/>
@@ -6066,6 +6109,7 @@
             <w:pPr>
               <w:spacing w:after="60"/>
             </w:pPr>
+            <w:bookmarkStart w:id="8" w:name="_Toc236169217"/>
             <w:r>
               <w:rPr>
                 <w:b/>
@@ -6096,18 +6140,22 @@
     </w:tbl>
     <w:p>
       <w:pPr>
-        <w:spacing w:after="200"/>
-      </w:pPr>
-    </w:p>
-    <w:p>
-      <w:pPr>
         <w:pStyle w:val="Ttulo2"/>
       </w:pPr>
-      <w:bookmarkStart w:id="7" w:name="_Toc236169216"/>
-      <w:r>
-        <w:t>8.2 Registrar un alumno</w:t>
-      </w:r>
-      <w:bookmarkEnd w:id="7"/>
+    </w:p>
+    <w:p>
+      <w:pPr>
+        <w:pStyle w:val="Ttulo2"/>
+      </w:pPr>
+    </w:p>
+    <w:p>
+      <w:pPr>
+        <w:pStyle w:val="Ttulo2"/>
+      </w:pPr>
+      <w:r>
+        <w:t>8.3 Perfil y cierre de sesión</w:t>
+      </w:r>
+      <w:bookmarkEnd w:id="8"/>
     </w:p>
     <w:p>
       <w:pPr>
@@ -6118,35 +6166,59 @@
         <w:rPr>
           <w:color w:val="1A1A1A"/>
         </w:rPr>
-        <w:t>Desde «Registrarse», complete nombre, apellido, DNI, teléfono, correo y contraseña. La cu</w:t>
-      </w:r>
+        <w:t xml:space="preserve">Una vez que haya ingresado a </w:t>
+      </w:r>
+      <w:proofErr w:type="spellStart"/>
       <w:r>
         <w:rPr>
           <w:color w:val="1A1A1A"/>
         </w:rPr>
-        <w:t>enta quedará pendiente hasta que un administrador la valide.</w:t>
-      </w:r>
-    </w:p>
-    <w:p>
-      <w:pPr>
-        <w:pStyle w:val="Ttulo2"/>
-      </w:pPr>
-      <w:bookmarkStart w:id="8" w:name="_Toc236169217"/>
-      <w:r>
-        <w:t>8.3 Perfil y cierre de sesión</w:t>
-      </w:r>
-      <w:bookmarkEnd w:id="8"/>
-    </w:p>
-    <w:p>
-      <w:pPr>
-        <w:spacing w:after="160" w:line="276" w:lineRule="auto"/>
-        <w:jc w:val="both"/>
-      </w:pPr>
+        <w:t>SysEqui</w:t>
+      </w:r>
+      <w:proofErr w:type="spellEnd"/>
       <w:r>
         <w:rPr>
           <w:color w:val="1A1A1A"/>
         </w:rPr>
-        <w:t>Abra el menú del avatar para consultar el perfil, editar los datos habilitados, cambiar la contraseña o cerrar sesión.</w:t>
+        <w:t xml:space="preserve">, </w:t>
+      </w:r>
+      <w:r>
+        <w:rPr>
+          <w:color w:val="1A1A1A"/>
+        </w:rPr>
+        <w:t>puede abrir</w:t>
+      </w:r>
+      <w:r>
+        <w:rPr>
+          <w:color w:val="1A1A1A"/>
+        </w:rPr>
+        <w:t xml:space="preserve"> el menú del avatar</w:t>
+      </w:r>
+      <w:r>
+        <w:rPr>
+          <w:color w:val="1A1A1A"/>
+        </w:rPr>
+        <w:t xml:space="preserve">, haciendo </w:t>
+      </w:r>
+      <w:proofErr w:type="spellStart"/>
+      <w:r>
+        <w:rPr>
+          <w:color w:val="1A1A1A"/>
+        </w:rPr>
+        <w:t>click</w:t>
+      </w:r>
+      <w:proofErr w:type="spellEnd"/>
+      <w:r>
+        <w:rPr>
+          <w:color w:val="1A1A1A"/>
+        </w:rPr>
+        <w:t xml:space="preserve"> en el icono arriba a la </w:t>
+      </w:r>
+      <w:r>
+        <w:rPr>
+          <w:color w:val="1A1A1A"/>
+        </w:rPr>
+        <w:t xml:space="preserve"> para consultar el perfil, editar los datos habilitados, cambiar la contraseña o cerrar sesión.</w:t>
       </w:r>
     </w:p>
     <w:p>
@@ -6175,12 +6247,6 @@
         <w:gridCol w:w="9480"/>
       </w:tblGrid>
       <w:tr>
-        <w:tblPrEx>
-          <w:tblCellMar>
-            <w:top w:w="0" w:type="dxa"/>
-            <w:bottom w:w="0" w:type="dxa"/>
-          </w:tblCellMar>
-        </w:tblPrEx>
         <w:tc>
           <w:tcPr>
             <w:tcW w:w="0" w:type="auto"/>
@@ -6277,13 +6343,7 @@
         <w:rPr>
           <w:color w:val="1A1A1A"/>
         </w:rPr>
-        <w:t>El menú lateral reúne las funciones exclusivas del administrador. Puede abrirse desde la pestaña ubicada en el borde izquierd</w:t>
-      </w:r>
-      <w:r>
-        <w:rPr>
-          <w:color w:val="1A1A1A"/>
-        </w:rPr>
-        <w:t>o de la pantalla o presionando F2. Para cerrarlo, vuelva a presionar F2, pulse fuera del panel o utilice la opción de cierre.</w:t>
+        <w:t>El menú lateral reúne las funciones exclusivas del administrador. Puede abrirse desde la pestaña ubicada en el borde izquierdo de la pantalla o presionando F2. Para cerrarlo, vuelva a presionar F2, pulse fuera del panel o utilice la opción de cierre.</w:t>
       </w:r>
     </w:p>
     <w:p>
@@ -6341,33 +6401,21 @@
         <w:rPr>
           <w:color w:val="1A1A1A"/>
         </w:rPr>
-        <w:t>En la part</w:t>
-      </w:r>
+        <w:t xml:space="preserve">En la parte superior del menú se encuentra «Buscar alumno por DNI». Escriba el DNI sin puntos y presione </w:t>
+      </w:r>
+      <w:proofErr w:type="spellStart"/>
       <w:r>
         <w:rPr>
           <w:color w:val="1A1A1A"/>
         </w:rPr>
-        <w:t xml:space="preserve">e superior del menú se encuentra «Buscar alumno por DNI». Escriba el DNI sin puntos y presione </w:t>
-      </w:r>
-      <w:proofErr w:type="spellStart"/>
+        <w:t>Enter</w:t>
+      </w:r>
+      <w:proofErr w:type="spellEnd"/>
       <w:r>
         <w:rPr>
           <w:color w:val="1A1A1A"/>
         </w:rPr>
-        <w:t>Enter</w:t>
-      </w:r>
-      <w:proofErr w:type="spellEnd"/>
-      <w:r>
-        <w:rPr>
-          <w:color w:val="1A1A1A"/>
-        </w:rPr>
-        <w:t>. El sistema abrirá «Asignar Equivalencias» con la búsqueda preparada para ese alumno. Antes de continuar, compruebe que el nombre, apellido y DNI correspon</w:t>
-      </w:r>
-      <w:r>
-        <w:rPr>
-          <w:color w:val="1A1A1A"/>
-        </w:rPr>
-        <w:t>dan a la persona correcta.</w:t>
+        <w:t>. El sistema abrirá «Asignar Equivalencias» con la búsqueda preparada para ese alumno. Antes de continuar, compruebe que el nombre, apellido y DNI correspondan a la persona correcta.</w:t>
       </w:r>
     </w:p>
     <w:p>
@@ -6396,12 +6444,6 @@
         <w:gridCol w:w="9486"/>
       </w:tblGrid>
       <w:tr>
-        <w:tblPrEx>
-          <w:tblCellMar>
-            <w:top w:w="0" w:type="dxa"/>
-            <w:bottom w:w="0" w:type="dxa"/>
-          </w:tblCellMar>
-        </w:tblPrEx>
         <w:tc>
           <w:tcPr>
             <w:tcW w:w="0" w:type="auto"/>
@@ -6512,13 +6554,7 @@
         <w:rPr>
           <w:color w:val="1A1A1A"/>
         </w:rPr>
-        <w:t>Abre el panel «Resumen general». Muestra indicadores de alumnos, profesores, preceptores, cursos y mater</w:t>
-      </w:r>
-      <w:r>
-        <w:rPr>
-          <w:color w:val="1A1A1A"/>
-        </w:rPr>
-        <w:t>ias. Las tarjetas de personas permiten consultar los integrantes activos de cada rol. Utilice esta pantalla para comprobar rápidamente el estado general antes de realizar modificaciones.</w:t>
+        <w:t>Abre el panel «Resumen general». Muestra indicadores de alumnos, profesores, preceptores, cursos y materias. Las tarjetas de personas permiten consultar los integrantes activos de cada rol. Utilice esta pantalla para comprobar rápidamente el estado general antes de realizar modificaciones.</w:t>
       </w:r>
     </w:p>
     <w:p>
@@ -6543,13 +6579,7 @@
         <w:rPr>
           <w:color w:val="1A1A1A"/>
         </w:rPr>
-        <w:t>Muestra los alumnos registrados. Permite buscar un a</w:t>
-      </w:r>
-      <w:r>
-        <w:rPr>
-          <w:color w:val="1A1A1A"/>
-        </w:rPr>
-        <w:t>lumno por DNI, consultar sus datos y editar la información habilitada. Revise cuidadosamente el registro antes de guardar cambios.</w:t>
+        <w:t>Muestra los alumnos registrados. Permite buscar un alumno por DNI, consultar sus datos y editar la información habilitada. Revise cuidadosamente el registro antes de guardar cambios.</w:t>
       </w:r>
     </w:p>
     <w:p>
@@ -6575,13 +6605,7 @@
           <w:color w:val="1A1A1A"/>
         </w:rPr>
         <w:lastRenderedPageBreak/>
-        <w:t>Permite buscar un alumno, asignarle una materia como equivalencia pendiente, consultar sus pendientes y</w:t>
-      </w:r>
-      <w:r>
-        <w:rPr>
-          <w:color w:val="1A1A1A"/>
-        </w:rPr>
-        <w:t xml:space="preserve"> cursos asignados, retirar una asignación y cargar una nota cuando corresponda. El flujo completo se explica en la sección 3.4.</w:t>
+        <w:t>Permite buscar un alumno, asignarle una materia como equivalencia pendiente, consultar sus pendientes y cursos asignados, retirar una asignación y cargar una nota cuando corresponda. El flujo completo se explica en la sección 3.4.</w:t>
       </w:r>
     </w:p>
     <w:p>
@@ -6619,15 +6643,32 @@
           <w:bCs/>
           <w:color w:val="2E5395"/>
         </w:rPr>
-        <w:t>Crear C</w:t>
-      </w:r>
+        <w:t>Crear Curso</w:t>
+      </w:r>
+    </w:p>
+    <w:p>
+      <w:pPr>
+        <w:spacing w:after="160" w:line="276" w:lineRule="auto"/>
+        <w:jc w:val="both"/>
+      </w:pPr>
+      <w:r>
+        <w:rPr>
+          <w:color w:val="1A1A1A"/>
+        </w:rPr>
+        <w:t>Permite seleccionar una materia, turno, fechas, docentes y alumnos. Al pulsar «Buscar Alumnos», se muestran quienes tienen pendiente la materia seleccionada. Revise el resumen antes de confirmar la creación.</w:t>
+      </w:r>
+    </w:p>
+    <w:p>
+      <w:pPr>
+        <w:spacing w:before="140" w:after="60"/>
+      </w:pPr>
       <w:r>
         <w:rPr>
           <w:b/>
           <w:bCs/>
           <w:color w:val="2E5395"/>
         </w:rPr>
-        <w:t>urso</w:t>
+        <w:t>Administrar Cursos</w:t>
       </w:r>
     </w:p>
     <w:p>
@@ -6639,7 +6680,7 @@
         <w:rPr>
           <w:color w:val="1A1A1A"/>
         </w:rPr>
-        <w:t>Permite seleccionar una materia, turno, fechas, docentes y alumnos. Al pulsar «Buscar Alumnos», se muestran quienes tienen pendiente la materia seleccionada. Revise el resumen antes de confirmar la creación.</w:t>
+        <w:t>Permite seleccionar un curso existente y modificar sus alumnos, docentes, materia, turno o fechas disponibles. Los cambios solo quedan registrados después de pulsar «Guardar cambios».</w:t>
       </w:r>
     </w:p>
     <w:p>
@@ -6652,7 +6693,7 @@
           <w:bCs/>
           <w:color w:val="2E5395"/>
         </w:rPr>
-        <w:t>Administrar Cursos</w:t>
+        <w:t>Lista de Materias</w:t>
       </w:r>
     </w:p>
     <w:p>
@@ -6664,13 +6705,7 @@
         <w:rPr>
           <w:color w:val="1A1A1A"/>
         </w:rPr>
-        <w:t>Permite seleccionar un c</w:t>
-      </w:r>
-      <w:r>
-        <w:rPr>
-          <w:color w:val="1A1A1A"/>
-        </w:rPr>
-        <w:t>urso existente y modificar sus alumnos, docentes, materia, turno o fechas disponibles. Los cambios solo quedan registrados después de pulsar «Guardar cambios».</w:t>
+        <w:t>Permite consultar, crear y editar materias, además de activarlas, desactivarlas o eliminarlas. Antes de cambiar el estado o eliminar una materia, compruebe que no sea necesaria para cursos o equivalencias vigentes.</w:t>
       </w:r>
     </w:p>
     <w:p>
@@ -6683,7 +6718,7 @@
           <w:bCs/>
           <w:color w:val="2E5395"/>
         </w:rPr>
-        <w:t>Lista de Materias</w:t>
+        <w:t>Gestión Profesores</w:t>
       </w:r>
     </w:p>
     <w:p>
@@ -6695,13 +6730,7 @@
         <w:rPr>
           <w:color w:val="1A1A1A"/>
         </w:rPr>
-        <w:t>Permite consultar, crear y editar materias, además de activarlas, desactivarla</w:t>
-      </w:r>
-      <w:r>
-        <w:rPr>
-          <w:color w:val="1A1A1A"/>
-        </w:rPr>
-        <w:t>s o eliminarlas. Antes de cambiar el estado o eliminar una materia, compruebe que no sea necesaria para cursos o equivalencias vigentes.</w:t>
+        <w:t>Permite consultar y administrar profesores y preceptores. Desde esta pantalla se pueden crear registros, editar datos, asignar el rol correcto, cambiar su estado y eliminar usuarios cuando corresponda. El DNI debe contener ocho números.</w:t>
       </w:r>
     </w:p>
     <w:p>
@@ -6714,7 +6743,7 @@
           <w:bCs/>
           <w:color w:val="2E5395"/>
         </w:rPr>
-        <w:t>Gestión Profesores</w:t>
+        <w:t>Cerrar Sesión</w:t>
       </w:r>
     </w:p>
     <w:p>
@@ -6726,38 +6755,7 @@
         <w:rPr>
           <w:color w:val="1A1A1A"/>
         </w:rPr>
-        <w:t>Permite consultar y administrar profesores y preceptores. Desde esta pantalla se pueden crear registros, editar datos, asignar el rol correcto, cambiar su estado y eliminar usuarios cuando corresponda. El DNI debe contener ocho números.</w:t>
-      </w:r>
-    </w:p>
-    <w:p>
-      <w:pPr>
-        <w:spacing w:before="140" w:after="60"/>
-      </w:pPr>
-      <w:r>
-        <w:rPr>
-          <w:b/>
-          <w:bCs/>
-          <w:color w:val="2E5395"/>
-        </w:rPr>
-        <w:t>Cerrar Sesión</w:t>
-      </w:r>
-    </w:p>
-    <w:p>
-      <w:pPr>
-        <w:spacing w:after="160" w:line="276" w:lineRule="auto"/>
-        <w:jc w:val="both"/>
-      </w:pPr>
-      <w:r>
-        <w:rPr>
-          <w:color w:val="1A1A1A"/>
-        </w:rPr>
-        <w:t>Final</w:t>
-      </w:r>
-      <w:r>
-        <w:rPr>
-          <w:color w:val="1A1A1A"/>
-        </w:rPr>
-        <w:t>iza de forma segura la sesión actual. Confirme el cierre cuando el sistema lo solicite, especialmente en equipos compartidos. También puede cerrar sesión desde el menú del avatar ubicado en la barra superior.</w:t>
+        <w:t>Finaliza de forma segura la sesión actual. Confirme el cierre cuando el sistema lo solicite, especialmente en equipos compartidos. También puede cerrar sesión desde el menú del avatar ubicado en la barra superior.</w:t>
       </w:r>
     </w:p>
     <w:p>
@@ -6786,12 +6784,6 @@
         <w:gridCol w:w="9480"/>
       </w:tblGrid>
       <w:tr>
-        <w:tblPrEx>
-          <w:tblCellMar>
-            <w:top w:w="0" w:type="dxa"/>
-            <w:bottom w:w="0" w:type="dxa"/>
-          </w:tblCellMar>
-        </w:tblPrEx>
         <w:tc>
           <w:tcPr>
             <w:tcW w:w="0" w:type="auto"/>
@@ -6831,17 +6823,7 @@
                 <w:sz w:val="18"/>
                 <w:szCs w:val="18"/>
               </w:rPr>
-              <w:t xml:space="preserve">Figura 6D. Panel Resumen </w:t>
-            </w:r>
-            <w:r>
-              <w:rPr>
-                <w:i/>
-                <w:iCs/>
-                <w:color w:val="8C8C8C"/>
-                <w:sz w:val="18"/>
-                <w:szCs w:val="18"/>
-              </w:rPr>
-              <w:t>general con los indicadores administrativos.</w:t>
+              <w:t>Figura 6D. Panel Resumen general con los indicadores administrativos.</w:t>
             </w:r>
           </w:p>
         </w:tc>
@@ -6873,12 +6855,6 @@
         <w:gridCol w:w="9458"/>
       </w:tblGrid>
       <w:tr>
-        <w:tblPrEx>
-          <w:tblCellMar>
-            <w:top w:w="0" w:type="dxa"/>
-            <w:bottom w:w="0" w:type="dxa"/>
-          </w:tblCellMar>
-        </w:tblPrEx>
         <w:tc>
           <w:tcPr>
             <w:tcW w:w="0" w:type="auto"/>
@@ -6956,8 +6932,6 @@
       </w:r>
       <w:r>
         <w:tab/>
-      </w:r>
-      <w:r>
         <w:t>Abra «Validar alumnos».</w:t>
       </w:r>
     </w:p>
@@ -7057,10 +7031,7 @@
       </w:r>
       <w:r>
         <w:tab/>
-        <w:t>Ing</w:t>
-      </w:r>
-      <w:r>
-        <w:t>rese el DNI del alumno.</w:t>
+        <w:t>Ingrese el DNI del alumno.</w:t>
       </w:r>
     </w:p>
     <w:p>
@@ -7185,8 +7156,6 @@
       </w:r>
       <w:r>
         <w:tab/>
-      </w:r>
-      <w:r>
         <w:t>Ingrese el DNI del alumno, pulse «Buscar Alumno» y confirme que la persona seleccionada sea la correcta.</w:t>
       </w:r>
     </w:p>
@@ -7231,10 +7200,7 @@
       </w:r>
       <w:r>
         <w:tab/>
-        <w:t>Confirme la asignación. En esta etapa no cargue una nota: la materia queda</w:t>
-      </w:r>
-      <w:r>
-        <w:t>rá registrada en «Equivalencias pendientes».</w:t>
+        <w:t>Confirme la asignación. En esta etapa no cargue una nota: la materia quedará registrada en «Equivalencias pendientes».</w:t>
       </w:r>
     </w:p>
     <w:p>
@@ -7285,12 +7251,6 @@
         <w:gridCol w:w="9458"/>
       </w:tblGrid>
       <w:tr>
-        <w:tblPrEx>
-          <w:tblCellMar>
-            <w:top w:w="0" w:type="dxa"/>
-            <w:bottom w:w="0" w:type="dxa"/>
-          </w:tblCellMar>
-        </w:tblPrEx>
         <w:tc>
           <w:tcPr>
             <w:tcW w:w="0" w:type="auto"/>
@@ -7360,12 +7320,6 @@
         <w:gridCol w:w="9480"/>
       </w:tblGrid>
       <w:tr>
-        <w:tblPrEx>
-          <w:tblCellMar>
-            <w:top w:w="0" w:type="dxa"/>
-            <w:bottom w:w="0" w:type="dxa"/>
-          </w:tblCellMar>
-        </w:tblPrEx>
         <w:tc>
           <w:tcPr>
             <w:tcW w:w="0" w:type="auto"/>
@@ -7405,17 +7359,7 @@
                 <w:sz w:val="18"/>
                 <w:szCs w:val="18"/>
               </w:rPr>
-              <w:t>Figura 6A. Alumno con la materia registrada en Equivalenc</w:t>
-            </w:r>
-            <w:r>
-              <w:rPr>
-                <w:i/>
-                <w:iCs/>
-                <w:color w:val="8C8C8C"/>
-                <w:sz w:val="18"/>
-                <w:szCs w:val="18"/>
-              </w:rPr>
-              <w:t>ias pendientes.</w:t>
+              <w:t>Figura 6A. Alumno con la materia registrada en Equivalencias pendientes.</w:t>
             </w:r>
           </w:p>
         </w:tc>
@@ -7477,8 +7421,6 @@
       </w:r>
       <w:r>
         <w:tab/>
-      </w:r>
-      <w:r>
         <w:t>Seleccione exactamente la misma materia que figura como pendiente para el alumno.</w:t>
       </w:r>
     </w:p>
@@ -7567,8 +7509,6 @@
       </w:r>
       <w:r>
         <w:tab/>
-      </w:r>
-      <w:r>
         <w:t>Asigne el docente, el turno y las fechas correspondientes.</w:t>
       </w:r>
     </w:p>
@@ -7642,12 +7582,6 @@
         <w:gridCol w:w="9480"/>
       </w:tblGrid>
       <w:tr>
-        <w:tblPrEx>
-          <w:tblCellMar>
-            <w:top w:w="0" w:type="dxa"/>
-            <w:bottom w:w="0" w:type="dxa"/>
-          </w:tblCellMar>
-        </w:tblPrEx>
         <w:tc>
           <w:tcPr>
             <w:tcW w:w="0" w:type="auto"/>
@@ -7718,13 +7652,7 @@
           <w:color w:val="1A1A1A"/>
         </w:rPr>
         <w:lastRenderedPageBreak/>
-        <w:t>Una vez iniciado el curso, el docente o el administrador podrá cargar la nota. Cuando la nota alcance la condición de aprobación config</w:t>
-      </w:r>
-      <w:r>
-        <w:rPr>
-          <w:color w:val="1A1A1A"/>
-        </w:rPr>
-        <w:t>urada, la materia dejará de figurar como pendiente y pasará a las equivalencias completadas del alumno.</w:t>
+        <w:t>Una vez iniciado el curso, el docente o el administrador podrá cargar la nota. Cuando la nota alcance la condición de aprobación configurada, la materia dejará de figurar como pendiente y pasará a las equivalencias completadas del alumno.</w:t>
       </w:r>
     </w:p>
     <w:p>
@@ -7753,12 +7681,6 @@
         <w:gridCol w:w="9458"/>
       </w:tblGrid>
       <w:tr>
-        <w:tblPrEx>
-          <w:tblCellMar>
-            <w:top w:w="0" w:type="dxa"/>
-            <w:bottom w:w="0" w:type="dxa"/>
-          </w:tblCellMar>
-        </w:tblPrEx>
         <w:tc>
           <w:tcPr>
             <w:tcW w:w="0" w:type="auto"/>
@@ -7796,15 +7718,7 @@
                 <w:sz w:val="20"/>
                 <w:szCs w:val="20"/>
               </w:rPr>
-              <w:t>No cargue una nota al registrar la equivalencia si el objetivo es incorporar al alumno a un curso futuro. Primero debe quedar pendiente, lu</w:t>
-            </w:r>
-            <w:r>
-              <w:rPr>
-                <w:color w:val="1A1A1A"/>
-                <w:sz w:val="20"/>
-                <w:szCs w:val="20"/>
-              </w:rPr>
-              <w:t>ego agregarse al curso y finalmente calificarse.</w:t>
+              <w:t>No cargue una nota al registrar la equivalencia si el objetivo es incorporar al alumno a un curso futuro. Primero debe quedar pendiente, luego agregarse al curso y finalmente calificarse.</w:t>
             </w:r>
           </w:p>
         </w:tc>
@@ -7836,12 +7750,6 @@
         <w:gridCol w:w="9480"/>
       </w:tblGrid>
       <w:tr>
-        <w:tblPrEx>
-          <w:tblCellMar>
-            <w:top w:w="0" w:type="dxa"/>
-            <w:bottom w:w="0" w:type="dxa"/>
-          </w:tblCellMar>
-        </w:tblPrEx>
         <w:tc>
           <w:tcPr>
             <w:tcW w:w="0" w:type="auto"/>
@@ -7911,13 +7819,7 @@
         <w:rPr>
           <w:color w:val="1A1A1A"/>
         </w:rPr>
-        <w:t>Los avisos se muestran en la página Inicio de alumnos, profesores, preceptores y administradores. Cada tarjeta presenta título, fecha, autor y contenido. Los cuatro colores de fondo se alternan automáticamente y vuelven a comenzar a partir del quinto aviso</w:t>
-      </w:r>
-      <w:r>
-        <w:rPr>
-          <w:color w:val="1A1A1A"/>
-        </w:rPr>
-        <w:t>.</w:t>
+        <w:t>Los avisos se muestran en la página Inicio de alumnos, profesores, preceptores y administradores. Cada tarjeta presenta título, fecha, autor y contenido. Los cuatro colores de fondo se alternan automáticamente y vuelven a comenzar a partir del quinto aviso.</w:t>
       </w:r>
     </w:p>
     <w:p>
@@ -7993,8 +7895,6 @@
       </w:r>
       <w:r>
         <w:tab/>
-      </w:r>
-      <w:r>
         <w:t>Escriba un título de hasta 120 caracteres y un contenido de hasta 2000 caracteres.</w:t>
       </w:r>
     </w:p>
@@ -8039,10 +7939,7 @@
       </w:r>
       <w:r>
         <w:tab/>
-        <w:t>Pulse «Guardar». El sistema registrará automáticamente como autor el</w:t>
-      </w:r>
-      <w:r>
-        <w:t xml:space="preserve"> nombre y apellido del administrador.</w:t>
+        <w:t>Pulse «Guardar». El sistema registrará automáticamente como autor el nombre y apellido del administrador.</w:t>
       </w:r>
     </w:p>
     <w:p>
@@ -8064,13 +7961,7 @@
         <w:rPr>
           <w:color w:val="1A1A1A"/>
         </w:rPr>
-        <w:t>Pulse «Editar» en la tarjeta correspondiente. Modifique el título, el contenido o el estado y seleccione «Guardar». Los avisos inactivos aparecen atenuados y con la etiqueta «Inactivo» p</w:t>
-      </w:r>
-      <w:r>
-        <w:rPr>
-          <w:color w:val="1A1A1A"/>
-        </w:rPr>
-        <w:t>ara el administrador, pero no son visibles para los demás usuarios.</w:t>
+        <w:t>Pulse «Editar» en la tarjeta correspondiente. Modifique el título, el contenido o el estado y seleccione «Guardar». Los avisos inactivos aparecen atenuados y con la etiqueta «Inactivo» para el administrador, pero no son visibles para los demás usuarios.</w:t>
       </w:r>
     </w:p>
     <w:p>
@@ -8092,13 +7983,7 @@
         <w:rPr>
           <w:color w:val="1A1A1A"/>
         </w:rPr>
-        <w:t>Pulse «Eliminar» en la tarjeta y confirme la operación. La eliminación es definitiva; si desea conservar el aviso para utilizarlo más adelante, edítelo y cambie su estado</w:t>
-      </w:r>
-      <w:r>
-        <w:rPr>
-          <w:color w:val="1A1A1A"/>
-        </w:rPr>
-        <w:t xml:space="preserve"> a inactivo.</w:t>
+        <w:t>Pulse «Eliminar» en la tarjeta y confirme la operación. La eliminación es definitiva; si desea conservar el aviso para utilizarlo más adelante, edítelo y cambie su estado a inactivo.</w:t>
       </w:r>
     </w:p>
     <w:p>
@@ -8120,13 +8005,7 @@
         <w:rPr>
           <w:color w:val="1A1A1A"/>
         </w:rPr>
-        <w:t>Los usuarios no administradores ven únicamente los avisos activos, ordenados del más reciente al más antiguo. No disponen de botones para crear, editar o eliminar. Si no existen publicaciones activas, Inicio m</w:t>
-      </w:r>
-      <w:r>
-        <w:rPr>
-          <w:color w:val="1A1A1A"/>
-        </w:rPr>
-        <w:t>uestra «No hay avisos disponibles».</w:t>
+        <w:t>Los usuarios no administradores ven únicamente los avisos activos, ordenados del más reciente al más antiguo. No disponen de botones para crear, editar o eliminar. Si no existen publicaciones activas, Inicio muestra «No hay avisos disponibles».</w:t>
       </w:r>
     </w:p>
     <w:p>
@@ -8161,13 +8040,7 @@
           <w:color w:val="1A1A1A"/>
         </w:rPr>
         <w:lastRenderedPageBreak/>
-        <w:t>El administrador puede solicitar un cambio</w:t>
-      </w:r>
-      <w:r>
-        <w:rPr>
-          <w:color w:val="1A1A1A"/>
-        </w:rPr>
-        <w:t xml:space="preserve"> obligatorio para alumnos, profesores y preceptores activos. Esta función no está disponible para cuentas administrativas.</w:t>
+        <w:t>El administrador puede solicitar un cambio obligatorio para alumnos, profesores y preceptores activos. Esta función no está disponible para cuentas administrativas.</w:t>
       </w:r>
     </w:p>
     <w:p>
@@ -8221,10 +8094,7 @@
       </w:r>
       <w:r>
         <w:tab/>
-        <w:t>Busque al usuario por</w:t>
-      </w:r>
-      <w:r>
-        <w:t xml:space="preserve"> DNI o mediante los filtros disponibles.</w:t>
+        <w:t>Busque al usuario por DNI o mediante los filtros disponibles.</w:t>
       </w:r>
     </w:p>
     <w:p>
@@ -8290,10 +8160,7 @@
       </w:r>
       <w:r>
         <w:tab/>
-        <w:t>Lea la advertencia y pulse «Restablecer». La solicitud tendr</w:t>
-      </w:r>
-      <w:r>
-        <w:t>á una vigencia de 24 horas.</w:t>
+        <w:t>Lea la advertencia y pulse «Restablecer». La solicitud tendrá una vigencia de 24 horas.</w:t>
       </w:r>
     </w:p>
     <w:p>
@@ -8347,8 +8214,6 @@
       </w:r>
       <w:r>
         <w:tab/>
-      </w:r>
-      <w:r>
         <w:t>El sistema lo dirigirá a «Crear una contraseña nueva» sin iniciar una sesión normal.</w:t>
       </w:r>
     </w:p>
@@ -8471,12 +8336,6 @@
         <w:gridCol w:w="9458"/>
       </w:tblGrid>
       <w:tr>
-        <w:tblPrEx>
-          <w:tblCellMar>
-            <w:top w:w="0" w:type="dxa"/>
-            <w:bottom w:w="0" w:type="dxa"/>
-          </w:tblCellMar>
-        </w:tblPrEx>
         <w:tc>
           <w:tcPr>
             <w:tcW w:w="0" w:type="auto"/>
@@ -8514,15 +8373,7 @@
                 <w:sz w:val="20"/>
                 <w:szCs w:val="20"/>
               </w:rPr>
-              <w:t xml:space="preserve">Durante </w:t>
-            </w:r>
-            <w:r>
-              <w:rPr>
-                <w:color w:val="1A1A1A"/>
-                <w:sz w:val="20"/>
-                <w:szCs w:val="20"/>
-              </w:rPr>
-              <w:t>las 24 horas de vigencia, cualquier persona que conozca el DNI puede establecer una contraseña nueva. El administrador debe realizar la operación únicamente cuando el usuario esté preparado para completar el cambio y avisarle de inmediato.</w:t>
+              <w:t>Durante las 24 horas de vigencia, cualquier persona que conozca el DNI puede establecer una contraseña nueva. El administrador debe realizar la operación únicamente cuando el usuario esté preparado para completar el cambio y avisarle de inmediato.</w:t>
             </w:r>
           </w:p>
         </w:tc>
@@ -8539,10 +8390,7 @@
       <w:bookmarkStart w:id="30" w:name="_Toc236169239"/>
       <w:r>
         <w:lastRenderedPageBreak/>
-        <w:t xml:space="preserve">4. </w:t>
-      </w:r>
-      <w:r>
-        <w:t>Gestión académica del administrador</w:t>
+        <w:t>4. Gestión académica del administrador</w:t>
       </w:r>
       <w:bookmarkEnd w:id="30"/>
     </w:p>
@@ -8619,10 +8467,7 @@
       </w:r>
       <w:r>
         <w:tab/>
-        <w:t>Seleccione la m</w:t>
-      </w:r>
-      <w:r>
-        <w:t>ateria y complete los datos solicitados.</w:t>
+        <w:t>Seleccione la materia y complete los datos solicitados.</w:t>
       </w:r>
     </w:p>
     <w:p>
@@ -8697,10 +8542,7 @@
       </w:pPr>
       <w:bookmarkStart w:id="34" w:name="_Toc236169243"/>
       <w:r>
-        <w:t>4.4 Profes</w:t>
-      </w:r>
-      <w:r>
-        <w:t>ores y personal</w:t>
+        <w:t>4.4 Profesores y personal</w:t>
       </w:r>
       <w:bookmarkEnd w:id="34"/>
     </w:p>
@@ -8742,12 +8584,6 @@
         <w:gridCol w:w="9480"/>
       </w:tblGrid>
       <w:tr>
-        <w:tblPrEx>
-          <w:tblCellMar>
-            <w:top w:w="0" w:type="dxa"/>
-            <w:bottom w:w="0" w:type="dxa"/>
-          </w:tblCellMar>
-        </w:tblPrEx>
         <w:tc>
           <w:tcPr>
             <w:tcW w:w="0" w:type="auto"/>
@@ -8908,10 +8744,7 @@
       </w:r>
       <w:r>
         <w:tab/>
-        <w:t>Use «Pendientes» para revis</w:t>
-      </w:r>
-      <w:r>
-        <w:t>ar equivalencias no completadas.</w:t>
+        <w:t>Use «Pendientes» para revisar equivalencias no completadas.</w:t>
       </w:r>
     </w:p>
     <w:p>
@@ -8962,12 +8795,6 @@
         <w:gridCol w:w="9458"/>
       </w:tblGrid>
       <w:tr>
-        <w:tblPrEx>
-          <w:tblCellMar>
-            <w:top w:w="0" w:type="dxa"/>
-            <w:bottom w:w="0" w:type="dxa"/>
-          </w:tblCellMar>
-        </w:tblPrEx>
         <w:tc>
           <w:tcPr>
             <w:tcW w:w="0" w:type="auto"/>
@@ -9037,12 +8864,6 @@
         <w:gridCol w:w="9480"/>
       </w:tblGrid>
       <w:tr>
-        <w:tblPrEx>
-          <w:tblCellMar>
-            <w:top w:w="0" w:type="dxa"/>
-            <w:bottom w:w="0" w:type="dxa"/>
-          </w:tblCellMar>
-        </w:tblPrEx>
         <w:tc>
           <w:tcPr>
             <w:tcW w:w="0" w:type="auto"/>
@@ -9137,8 +8958,6 @@
       </w:r>
       <w:r>
         <w:tab/>
-      </w:r>
-      <w:r>
         <w:t>Abra la opción «Docente».</w:t>
       </w:r>
     </w:p>
@@ -9256,12 +9075,6 @@
         <w:gridCol w:w="9458"/>
       </w:tblGrid>
       <w:tr>
-        <w:tblPrEx>
-          <w:tblCellMar>
-            <w:top w:w="0" w:type="dxa"/>
-            <w:bottom w:w="0" w:type="dxa"/>
-          </w:tblCellMar>
-        </w:tblPrEx>
         <w:tc>
           <w:tcPr>
             <w:tcW w:w="0" w:type="auto"/>
@@ -9329,13 +9142,7 @@
         <w:rPr>
           <w:color w:val="1A1A1A"/>
         </w:rPr>
-        <w:t>El preceptor accede al inicio y a las funciones que la configuración actual habilite. Si una opción necesaria no aparece, el administra</w:t>
-      </w:r>
-      <w:r>
-        <w:rPr>
-          <w:color w:val="1A1A1A"/>
-        </w:rPr>
-        <w:t>dor debe revisar el rol y la versión desplegada.</w:t>
+        <w:t>El preceptor accede al inicio y a las funciones que la configuración actual habilite. Si una opción necesaria no aparece, el administrador debe revisar el rol y la versión desplegada.</w:t>
       </w:r>
     </w:p>
     <w:p>
@@ -9364,12 +9171,6 @@
         <w:gridCol w:w="9480"/>
       </w:tblGrid>
       <w:tr>
-        <w:tblPrEx>
-          <w:tblCellMar>
-            <w:top w:w="0" w:type="dxa"/>
-            <w:bottom w:w="0" w:type="dxa"/>
-          </w:tblCellMar>
-        </w:tblPrEx>
         <w:tc>
           <w:tcPr>
             <w:tcW w:w="0" w:type="auto"/>
@@ -9523,12 +9324,6 @@
         <w:gridCol w:w="7015"/>
       </w:tblGrid>
       <w:tr>
-        <w:tblPrEx>
-          <w:tblCellMar>
-            <w:top w:w="0" w:type="dxa"/>
-            <w:bottom w:w="0" w:type="dxa"/>
-          </w:tblCellMar>
-        </w:tblPrEx>
         <w:trPr>
           <w:tblHeader/>
         </w:trPr>
@@ -9584,12 +9379,6 @@
         </w:tc>
       </w:tr>
       <w:tr>
-        <w:tblPrEx>
-          <w:tblCellMar>
-            <w:top w:w="0" w:type="dxa"/>
-            <w:bottom w:w="0" w:type="dxa"/>
-          </w:tblCellMar>
-        </w:tblPrEx>
         <w:tc>
           <w:tcPr>
             <w:tcW w:w="1300" w:type="pct"/>
@@ -9644,12 +9433,6 @@
         </w:tc>
       </w:tr>
       <w:tr>
-        <w:tblPrEx>
-          <w:tblCellMar>
-            <w:top w:w="0" w:type="dxa"/>
-            <w:bottom w:w="0" w:type="dxa"/>
-          </w:tblCellMar>
-        </w:tblPrEx>
         <w:tc>
           <w:tcPr>
             <w:tcW w:w="1300" w:type="pct"/>
@@ -9706,12 +9489,6 @@
         </w:tc>
       </w:tr>
       <w:tr>
-        <w:tblPrEx>
-          <w:tblCellMar>
-            <w:top w:w="0" w:type="dxa"/>
-            <w:bottom w:w="0" w:type="dxa"/>
-          </w:tblCellMar>
-        </w:tblPrEx>
         <w:tc>
           <w:tcPr>
             <w:tcW w:w="1300" w:type="pct"/>
@@ -9766,12 +9543,6 @@
         </w:tc>
       </w:tr>
       <w:tr>
-        <w:tblPrEx>
-          <w:tblCellMar>
-            <w:top w:w="0" w:type="dxa"/>
-            <w:bottom w:w="0" w:type="dxa"/>
-          </w:tblCellMar>
-        </w:tblPrEx>
         <w:tc>
           <w:tcPr>
             <w:tcW w:w="1300" w:type="pct"/>
@@ -9826,12 +9597,6 @@
         </w:tc>
       </w:tr>
       <w:tr>
-        <w:tblPrEx>
-          <w:tblCellMar>
-            <w:top w:w="0" w:type="dxa"/>
-            <w:bottom w:w="0" w:type="dxa"/>
-          </w:tblCellMar>
-        </w:tblPrEx>
         <w:tc>
           <w:tcPr>
             <w:tcW w:w="1300" w:type="pct"/>
@@ -9934,12 +9699,6 @@
         <w:gridCol w:w="9468"/>
       </w:tblGrid>
       <w:tr>
-        <w:tblPrEx>
-          <w:tblCellMar>
-            <w:top w:w="0" w:type="dxa"/>
-            <w:bottom w:w="0" w:type="dxa"/>
-          </w:tblCellMar>
-        </w:tblPrEx>
         <w:tc>
           <w:tcPr>
             <w:tcW w:w="0" w:type="auto"/>
@@ -10082,12 +9841,6 @@
         <w:gridCol w:w="9458"/>
       </w:tblGrid>
       <w:tr>
-        <w:tblPrEx>
-          <w:tblCellMar>
-            <w:top w:w="0" w:type="dxa"/>
-            <w:bottom w:w="0" w:type="dxa"/>
-          </w:tblCellMar>
-        </w:tblPrEx>
         <w:tc>
           <w:tcPr>
             <w:tcW w:w="0" w:type="auto"/>
@@ -10177,12 +9930,6 @@
         <w:gridCol w:w="9468"/>
       </w:tblGrid>
       <w:tr>
-        <w:tblPrEx>
-          <w:tblCellMar>
-            <w:top w:w="0" w:type="dxa"/>
-            <w:bottom w:w="0" w:type="dxa"/>
-          </w:tblCellMar>
-        </w:tblPrEx>
         <w:tc>
           <w:tcPr>
             <w:tcW w:w="0" w:type="auto"/>
@@ -10244,12 +9991,6 @@
         <w:gridCol w:w="9480"/>
       </w:tblGrid>
       <w:tr>
-        <w:tblPrEx>
-          <w:tblCellMar>
-            <w:top w:w="0" w:type="dxa"/>
-            <w:bottom w:w="0" w:type="dxa"/>
-          </w:tblCellMar>
-        </w:tblPrEx>
         <w:tc>
           <w:tcPr>
             <w:tcW w:w="0" w:type="auto"/>
@@ -10422,8 +10163,6 @@
       </w:r>
       <w:r>
         <w:tab/>
-      </w:r>
-      <w:r>
         <w:t>Abra PowerShell en la carpeta principal del proyecto.</w:t>
       </w:r>
     </w:p>
@@ -10470,12 +10209,6 @@
         <w:gridCol w:w="9468"/>
       </w:tblGrid>
       <w:tr>
-        <w:tblPrEx>
-          <w:tblCellMar>
-            <w:top w:w="0" w:type="dxa"/>
-            <w:bottom w:w="0" w:type="dxa"/>
-          </w:tblCellMar>
-        </w:tblPrEx>
         <w:tc>
           <w:tcPr>
             <w:tcW w:w="0" w:type="auto"/>
@@ -10599,12 +10332,6 @@
         <w:gridCol w:w="9468"/>
       </w:tblGrid>
       <w:tr>
-        <w:tblPrEx>
-          <w:tblCellMar>
-            <w:top w:w="0" w:type="dxa"/>
-            <w:bottom w:w="0" w:type="dxa"/>
-          </w:tblCellMar>
-        </w:tblPrEx>
         <w:tc>
           <w:tcPr>
             <w:tcW w:w="0" w:type="auto"/>
@@ -10681,12 +10408,6 @@
         <w:gridCol w:w="9458"/>
       </w:tblGrid>
       <w:tr>
-        <w:tblPrEx>
-          <w:tblCellMar>
-            <w:top w:w="0" w:type="dxa"/>
-            <w:bottom w:w="0" w:type="dxa"/>
-          </w:tblCellMar>
-        </w:tblPrEx>
         <w:tc>
           <w:tcPr>
             <w:tcW w:w="0" w:type="auto"/>
@@ -10769,7 +10490,7 @@
                     </pic:cNvPicPr>
                   </pic:nvPicPr>
                   <pic:blipFill>
-                    <a:blip r:embed="rId7"/>
+                    <a:blip r:embed="rId9"/>
                     <a:srcRect/>
                     <a:stretch>
                       <a:fillRect/>
@@ -10880,12 +10601,6 @@
         <w:gridCol w:w="9468"/>
       </w:tblGrid>
       <w:tr>
-        <w:tblPrEx>
-          <w:tblCellMar>
-            <w:top w:w="0" w:type="dxa"/>
-            <w:bottom w:w="0" w:type="dxa"/>
-          </w:tblCellMar>
-        </w:tblPrEx>
         <w:tc>
           <w:tcPr>
             <w:tcW w:w="0" w:type="auto"/>
@@ -10951,12 +10666,6 @@
         <w:gridCol w:w="9480"/>
       </w:tblGrid>
       <w:tr>
-        <w:tblPrEx>
-          <w:tblCellMar>
-            <w:top w:w="0" w:type="dxa"/>
-            <w:bottom w:w="0" w:type="dxa"/>
-          </w:tblCellMar>
-        </w:tblPrEx>
         <w:tc>
           <w:tcPr>
             <w:tcW w:w="0" w:type="auto"/>
@@ -11058,12 +10767,6 @@
         <w:gridCol w:w="9468"/>
       </w:tblGrid>
       <w:tr>
-        <w:tblPrEx>
-          <w:tblCellMar>
-            <w:top w:w="0" w:type="dxa"/>
-            <w:bottom w:w="0" w:type="dxa"/>
-          </w:tblCellMar>
-        </w:tblPrEx>
         <w:tc>
           <w:tcPr>
             <w:tcW w:w="0" w:type="auto"/>
@@ -11168,12 +10871,6 @@
         <w:gridCol w:w="9468"/>
       </w:tblGrid>
       <w:tr>
-        <w:tblPrEx>
-          <w:tblCellMar>
-            <w:top w:w="0" w:type="dxa"/>
-            <w:bottom w:w="0" w:type="dxa"/>
-          </w:tblCellMar>
-        </w:tblPrEx>
         <w:tc>
           <w:tcPr>
             <w:tcW w:w="0" w:type="auto"/>
@@ -11200,9 +10897,9 @@
                 <w:szCs w:val="19"/>
                 <w:lang w:val="en-US"/>
               </w:rPr>
-              <w:t>Copy-</w:t>
-            </w:r>
-            <w:proofErr w:type="gramStart"/>
+              <w:t>Copy-Item .</w:t>
+            </w:r>
+            <w:proofErr w:type="spellStart"/>
             <w:r>
               <w:rPr>
                 <w:rFonts w:ascii="Consolas" w:eastAsia="Consolas" w:hAnsi="Consolas" w:cs="Consolas"/>
@@ -11211,9 +10908,9 @@
                 <w:szCs w:val="19"/>
                 <w:lang w:val="en-US"/>
               </w:rPr>
-              <w:t>Item .</w:t>
-            </w:r>
-            <w:proofErr w:type="spellStart"/>
+              <w:t>env.example</w:t>
+            </w:r>
+            <w:proofErr w:type="spellEnd"/>
             <w:r>
               <w:rPr>
                 <w:rFonts w:ascii="Consolas" w:eastAsia="Consolas" w:hAnsi="Consolas" w:cs="Consolas"/>
@@ -11222,9 +10919,16 @@
                 <w:szCs w:val="19"/>
                 <w:lang w:val="en-US"/>
               </w:rPr>
-              <w:t>env</w:t>
-            </w:r>
-            <w:proofErr w:type="gramEnd"/>
+              <w:t xml:space="preserve"> .env</w:t>
+            </w:r>
+          </w:p>
+          <w:p>
+            <w:pPr>
+              <w:spacing w:line="260" w:lineRule="auto"/>
+              <w:rPr>
+                <w:lang w:val="en-US"/>
+              </w:rPr>
+            </w:pPr>
             <w:r>
               <w:rPr>
                 <w:rFonts w:ascii="Consolas" w:eastAsia="Consolas" w:hAnsi="Consolas" w:cs="Consolas"/>
@@ -11233,39 +10937,8 @@
                 <w:szCs w:val="19"/>
                 <w:lang w:val="en-US"/>
               </w:rPr>
-              <w:t>.example</w:t>
-            </w:r>
-            <w:proofErr w:type="spellEnd"/>
-            <w:r>
-              <w:rPr>
-                <w:rFonts w:ascii="Consolas" w:eastAsia="Consolas" w:hAnsi="Consolas" w:cs="Consolas"/>
-                <w:color w:val="1A1A1A"/>
-                <w:sz w:val="19"/>
-                <w:szCs w:val="19"/>
-                <w:lang w:val="en-US"/>
-              </w:rPr>
-              <w:t xml:space="preserve"> .env</w:t>
-            </w:r>
-          </w:p>
-          <w:p>
-            <w:pPr>
-              <w:spacing w:line="260" w:lineRule="auto"/>
-              <w:rPr>
-                <w:lang w:val="en-US"/>
-              </w:rPr>
-            </w:pPr>
-            <w:proofErr w:type="gramStart"/>
-            <w:r>
-              <w:rPr>
-                <w:rFonts w:ascii="Consolas" w:eastAsia="Consolas" w:hAnsi="Consolas" w:cs="Consolas"/>
-                <w:color w:val="1A1A1A"/>
-                <w:sz w:val="19"/>
-                <w:szCs w:val="19"/>
-                <w:lang w:val="en-US"/>
-              </w:rPr>
               <w:t>notepad .env</w:t>
             </w:r>
-            <w:proofErr w:type="gramEnd"/>
           </w:p>
         </w:tc>
       </w:tr>
@@ -11311,12 +10984,6 @@
         <w:gridCol w:w="9468"/>
       </w:tblGrid>
       <w:tr>
-        <w:tblPrEx>
-          <w:tblCellMar>
-            <w:top w:w="0" w:type="dxa"/>
-            <w:bottom w:w="0" w:type="dxa"/>
-          </w:tblCellMar>
-        </w:tblPrEx>
         <w:tc>
           <w:tcPr>
             <w:tcW w:w="0" w:type="auto"/>
@@ -11343,17 +11010,7 @@
                 <w:szCs w:val="19"/>
                 <w:lang w:val="en-US"/>
               </w:rPr>
-              <w:t>MONGO_URI=m</w:t>
-            </w:r>
-            <w:r>
-              <w:rPr>
-                <w:rFonts w:ascii="Consolas" w:eastAsia="Consolas" w:hAnsi="Consolas" w:cs="Consolas"/>
-                <w:color w:val="1A1A1A"/>
-                <w:sz w:val="19"/>
-                <w:szCs w:val="19"/>
-                <w:lang w:val="en-US"/>
-              </w:rPr>
-              <w:t>ongodb://localhost:27017/sysequi</w:t>
+              <w:t>MONGO_URI=mongodb://localhost:27017/sysequi</w:t>
             </w:r>
           </w:p>
           <w:p>
@@ -11660,12 +11317,6 @@
         <w:gridCol w:w="9458"/>
       </w:tblGrid>
       <w:tr>
-        <w:tblPrEx>
-          <w:tblCellMar>
-            <w:top w:w="0" w:type="dxa"/>
-            <w:bottom w:w="0" w:type="dxa"/>
-          </w:tblCellMar>
-        </w:tblPrEx>
         <w:tc>
           <w:tcPr>
             <w:tcW w:w="0" w:type="auto"/>
@@ -11841,10 +11492,7 @@
       </w:r>
       <w:proofErr w:type="spellEnd"/>
       <w:r>
-        <w:t>, e</w:t>
-      </w:r>
-      <w:r>
-        <w:t>jecute:</w:t>
+        <w:t>, ejecute:</w:t>
       </w:r>
     </w:p>
     <w:tbl>
@@ -11868,12 +11516,6 @@
         <w:gridCol w:w="9468"/>
       </w:tblGrid>
       <w:tr>
-        <w:tblPrEx>
-          <w:tblCellMar>
-            <w:top w:w="0" w:type="dxa"/>
-            <w:bottom w:w="0" w:type="dxa"/>
-          </w:tblCellMar>
-        </w:tblPrEx>
         <w:tc>
           <w:tcPr>
             <w:tcW w:w="0" w:type="auto"/>
@@ -11950,12 +11592,6 @@
         <w:gridCol w:w="9458"/>
       </w:tblGrid>
       <w:tr>
-        <w:tblPrEx>
-          <w:tblCellMar>
-            <w:top w:w="0" w:type="dxa"/>
-            <w:bottom w:w="0" w:type="dxa"/>
-          </w:tblCellMar>
-        </w:tblPrEx>
         <w:tc>
           <w:tcPr>
             <w:tcW w:w="0" w:type="auto"/>
@@ -12094,12 +11730,6 @@
         <w:gridCol w:w="9486"/>
       </w:tblGrid>
       <w:tr>
-        <w:tblPrEx>
-          <w:tblCellMar>
-            <w:top w:w="0" w:type="dxa"/>
-            <w:bottom w:w="0" w:type="dxa"/>
-          </w:tblCellMar>
-        </w:tblPrEx>
         <w:tc>
           <w:tcPr>
             <w:tcW w:w="0" w:type="auto"/>
@@ -12137,7 +11767,7 @@
                           </pic:cNvPicPr>
                         </pic:nvPicPr>
                         <pic:blipFill>
-                          <a:blip r:embed="rId9"/>
+                          <a:blip r:embed="rId10"/>
                           <a:srcRect/>
                           <a:stretch>
                             <a:fillRect/>
@@ -12218,12 +11848,6 @@
         <w:gridCol w:w="9468"/>
       </w:tblGrid>
       <w:tr>
-        <w:tblPrEx>
-          <w:tblCellMar>
-            <w:top w:w="0" w:type="dxa"/>
-            <w:bottom w:w="0" w:type="dxa"/>
-          </w:tblCellMar>
-        </w:tblPrEx>
         <w:tc>
           <w:tcPr>
             <w:tcW w:w="0" w:type="auto"/>
@@ -12333,12 +11957,6 @@
         <w:gridCol w:w="9468"/>
       </w:tblGrid>
       <w:tr>
-        <w:tblPrEx>
-          <w:tblCellMar>
-            <w:top w:w="0" w:type="dxa"/>
-            <w:bottom w:w="0" w:type="dxa"/>
-          </w:tblCellMar>
-        </w:tblPrEx>
         <w:tc>
           <w:tcPr>
             <w:tcW w:w="0" w:type="auto"/>
@@ -12365,9 +11983,9 @@
                 <w:szCs w:val="19"/>
                 <w:lang w:val="en-US"/>
               </w:rPr>
-              <w:t>Copy-</w:t>
-            </w:r>
-            <w:proofErr w:type="gramStart"/>
+              <w:t>Copy-Item .</w:t>
+            </w:r>
+            <w:proofErr w:type="spellStart"/>
             <w:r>
               <w:rPr>
                 <w:rFonts w:ascii="Consolas" w:eastAsia="Consolas" w:hAnsi="Consolas" w:cs="Consolas"/>
@@ -12376,9 +11994,9 @@
                 <w:szCs w:val="19"/>
                 <w:lang w:val="en-US"/>
               </w:rPr>
-              <w:t>Item .</w:t>
-            </w:r>
-            <w:proofErr w:type="spellStart"/>
+              <w:t>env.example</w:t>
+            </w:r>
+            <w:proofErr w:type="spellEnd"/>
             <w:r>
               <w:rPr>
                 <w:rFonts w:ascii="Consolas" w:eastAsia="Consolas" w:hAnsi="Consolas" w:cs="Consolas"/>
@@ -12387,9 +12005,16 @@
                 <w:szCs w:val="19"/>
                 <w:lang w:val="en-US"/>
               </w:rPr>
-              <w:t>env</w:t>
-            </w:r>
-            <w:proofErr w:type="gramEnd"/>
+              <w:t xml:space="preserve"> .env</w:t>
+            </w:r>
+          </w:p>
+          <w:p>
+            <w:pPr>
+              <w:spacing w:line="260" w:lineRule="auto"/>
+              <w:rPr>
+                <w:lang w:val="en-US"/>
+              </w:rPr>
+            </w:pPr>
             <w:r>
               <w:rPr>
                 <w:rFonts w:ascii="Consolas" w:eastAsia="Consolas" w:hAnsi="Consolas" w:cs="Consolas"/>
@@ -12398,39 +12023,8 @@
                 <w:szCs w:val="19"/>
                 <w:lang w:val="en-US"/>
               </w:rPr>
-              <w:t>.example</w:t>
-            </w:r>
-            <w:proofErr w:type="spellEnd"/>
-            <w:r>
-              <w:rPr>
-                <w:rFonts w:ascii="Consolas" w:eastAsia="Consolas" w:hAnsi="Consolas" w:cs="Consolas"/>
-                <w:color w:val="1A1A1A"/>
-                <w:sz w:val="19"/>
-                <w:szCs w:val="19"/>
-                <w:lang w:val="en-US"/>
-              </w:rPr>
-              <w:t xml:space="preserve"> .env</w:t>
-            </w:r>
-          </w:p>
-          <w:p>
-            <w:pPr>
-              <w:spacing w:line="260" w:lineRule="auto"/>
-              <w:rPr>
-                <w:lang w:val="en-US"/>
-              </w:rPr>
-            </w:pPr>
-            <w:proofErr w:type="gramStart"/>
-            <w:r>
-              <w:rPr>
-                <w:rFonts w:ascii="Consolas" w:eastAsia="Consolas" w:hAnsi="Consolas" w:cs="Consolas"/>
-                <w:color w:val="1A1A1A"/>
-                <w:sz w:val="19"/>
-                <w:szCs w:val="19"/>
-                <w:lang w:val="en-US"/>
-              </w:rPr>
               <w:t>notepad .env</w:t>
             </w:r>
-            <w:proofErr w:type="gramEnd"/>
           </w:p>
         </w:tc>
       </w:tr>
@@ -12476,12 +12070,6 @@
         <w:gridCol w:w="9468"/>
       </w:tblGrid>
       <w:tr>
-        <w:tblPrEx>
-          <w:tblCellMar>
-            <w:top w:w="0" w:type="dxa"/>
-            <w:bottom w:w="0" w:type="dxa"/>
-          </w:tblCellMar>
-        </w:tblPrEx>
         <w:tc>
           <w:tcPr>
             <w:tcW w:w="0" w:type="auto"/>
@@ -12536,12 +12124,6 @@
         <w:gridCol w:w="9458"/>
       </w:tblGrid>
       <w:tr>
-        <w:tblPrEx>
-          <w:tblCellMar>
-            <w:top w:w="0" w:type="dxa"/>
-            <w:bottom w:w="0" w:type="dxa"/>
-          </w:tblCellMar>
-        </w:tblPrEx>
         <w:tc>
           <w:tcPr>
             <w:tcW w:w="0" w:type="auto"/>
@@ -12725,12 +12307,6 @@
         <w:gridCol w:w="9468"/>
       </w:tblGrid>
       <w:tr>
-        <w:tblPrEx>
-          <w:tblCellMar>
-            <w:top w:w="0" w:type="dxa"/>
-            <w:bottom w:w="0" w:type="dxa"/>
-          </w:tblCellMar>
-        </w:tblPrEx>
         <w:tc>
           <w:tcPr>
             <w:tcW w:w="0" w:type="auto"/>
@@ -12757,17 +12333,7 @@
                 <w:szCs w:val="19"/>
                 <w:lang w:val="en-US"/>
               </w:rPr>
-              <w:t>cd C:\Users\Admin\Desktop\SysEqui_GitHub\Back_S</w:t>
-            </w:r>
-            <w:r>
-              <w:rPr>
-                <w:rFonts w:ascii="Consolas" w:eastAsia="Consolas" w:hAnsi="Consolas" w:cs="Consolas"/>
-                <w:color w:val="1A1A1A"/>
-                <w:sz w:val="19"/>
-                <w:szCs w:val="19"/>
-                <w:lang w:val="en-US"/>
-              </w:rPr>
-              <w:t>ysEqui</w:t>
+              <w:t>cd C:\Users\Admin\Desktop\SysEqui_GitHub\Back_SysEqui</w:t>
             </w:r>
           </w:p>
           <w:p>
@@ -12904,12 +12470,6 @@
         <w:gridCol w:w="9468"/>
       </w:tblGrid>
       <w:tr>
-        <w:tblPrEx>
-          <w:tblCellMar>
-            <w:top w:w="0" w:type="dxa"/>
-            <w:bottom w:w="0" w:type="dxa"/>
-          </w:tblCellMar>
-        </w:tblPrEx>
         <w:tc>
           <w:tcPr>
             <w:tcW w:w="0" w:type="auto"/>
@@ -12992,13 +12552,7 @@
         <w:rPr>
           <w:color w:val="1A1A1A"/>
         </w:rPr>
-        <w:t>Abra la dirección informada por Vite, n</w:t>
-      </w:r>
-      <w:r>
-        <w:rPr>
-          <w:color w:val="1A1A1A"/>
-        </w:rPr>
-        <w:t>ormalmente http://localhost:5173.</w:t>
+        <w:t>Abra la dirección informada por Vite, normalmente http://localhost:5173.</w:t>
       </w:r>
     </w:p>
     <w:p>
@@ -13028,12 +12582,6 @@
         <w:gridCol w:w="7584"/>
       </w:tblGrid>
       <w:tr>
-        <w:tblPrEx>
-          <w:tblCellMar>
-            <w:top w:w="0" w:type="dxa"/>
-            <w:bottom w:w="0" w:type="dxa"/>
-          </w:tblCellMar>
-        </w:tblPrEx>
         <w:trPr>
           <w:tblHeader/>
         </w:trPr>
@@ -13089,12 +12637,6 @@
         </w:tc>
       </w:tr>
       <w:tr>
-        <w:tblPrEx>
-          <w:tblCellMar>
-            <w:top w:w="0" w:type="dxa"/>
-            <w:bottom w:w="0" w:type="dxa"/>
-          </w:tblCellMar>
-        </w:tblPrEx>
         <w:tc>
           <w:tcPr>
             <w:tcW w:w="1000" w:type="pct"/>
@@ -13149,12 +12691,6 @@
         </w:tc>
       </w:tr>
       <w:tr>
-        <w:tblPrEx>
-          <w:tblCellMar>
-            <w:top w:w="0" w:type="dxa"/>
-            <w:bottom w:w="0" w:type="dxa"/>
-          </w:tblCellMar>
-        </w:tblPrEx>
         <w:tc>
           <w:tcPr>
             <w:tcW w:w="1000" w:type="pct"/>
@@ -13211,12 +12747,6 @@
         </w:tc>
       </w:tr>
       <w:tr>
-        <w:tblPrEx>
-          <w:tblCellMar>
-            <w:top w:w="0" w:type="dxa"/>
-            <w:bottom w:w="0" w:type="dxa"/>
-          </w:tblCellMar>
-        </w:tblPrEx>
         <w:tc>
           <w:tcPr>
             <w:tcW w:w="1000" w:type="pct"/>
@@ -13273,12 +12803,6 @@
         </w:tc>
       </w:tr>
       <w:tr>
-        <w:tblPrEx>
-          <w:tblCellMar>
-            <w:top w:w="0" w:type="dxa"/>
-            <w:bottom w:w="0" w:type="dxa"/>
-          </w:tblCellMar>
-        </w:tblPrEx>
         <w:tc>
           <w:tcPr>
             <w:tcW w:w="1000" w:type="pct"/>
@@ -13359,12 +12883,6 @@
         <w:gridCol w:w="9480"/>
       </w:tblGrid>
       <w:tr>
-        <w:tblPrEx>
-          <w:tblCellMar>
-            <w:top w:w="0" w:type="dxa"/>
-            <w:bottom w:w="0" w:type="dxa"/>
-          </w:tblCellMar>
-        </w:tblPrEx>
         <w:tc>
           <w:tcPr>
             <w:tcW w:w="0" w:type="auto"/>
@@ -13547,10 +13065,7 @@
       </w:r>
       <w:r>
         <w:tab/>
-        <w:t>H</w:t>
-      </w:r>
-      <w:r>
-        <w:t>aga doble clic en «Control SysEqui.vbs». También puede utilizar «Control SysEqui.cmd» si necesita ver la consola.</w:t>
+        <w:t>Haga doble clic en «Control SysEqui.vbs». También puede utilizar «Control SysEqui.cmd» si necesita ver la consola.</w:t>
       </w:r>
     </w:p>
     <w:p>
@@ -13618,10 +13133,7 @@
       </w:r>
       <w:r>
         <w:tab/>
-        <w:t>Pulse «Iniciar todo</w:t>
-      </w:r>
-      <w:r>
-        <w:t xml:space="preserve">». El panel abrirá Docker Desktop si fuera necesario, iniciará MongoDB y luego levantará el </w:t>
+        <w:t xml:space="preserve">Pulse «Iniciar todo». El panel abrirá Docker Desktop si fuera necesario, iniciará MongoDB y luego levantará el </w:t>
       </w:r>
       <w:proofErr w:type="spellStart"/>
       <w:r>
@@ -13694,10 +13206,7 @@
       </w:r>
       <w:proofErr w:type="spellStart"/>
       <w:r>
-        <w:t>S</w:t>
-      </w:r>
-      <w:r>
-        <w:t>ysEqui</w:t>
+        <w:t>SysEqui</w:t>
       </w:r>
       <w:proofErr w:type="spellEnd"/>
       <w:r>
@@ -13771,8 +13280,6 @@
       </w:r>
       <w:r>
         <w:tab/>
-      </w:r>
-      <w:r>
         <w:t xml:space="preserve">Detener todo: cierra los componentes de </w:t>
       </w:r>
       <w:proofErr w:type="spellStart"/>
@@ -13841,8 +13348,6 @@
       </w:r>
       <w:r>
         <w:tab/>
-      </w:r>
-      <w:r>
         <w:t>Abrir logs: abre la carpeta de registros técnicos. Revise estos archivos cuando un componente no pueda iniciarse.</w:t>
       </w:r>
     </w:p>
@@ -13887,13 +13392,7 @@
         <w:rPr>
           <w:color w:val="1A1A1A"/>
         </w:rPr>
-        <w:t>«ON» indica q</w:t>
-      </w:r>
-      <w:r>
-        <w:rPr>
-          <w:color w:val="1A1A1A"/>
-        </w:rPr>
-        <w:t>ue el componente está disponible. «OFF» indica que está detenido o no respondió. «Inicio parcial» significa que solamente algunos componentes están activos; en ese caso, revise el registro mostrado en la parte inferior o pulse «Abrir logs».</w:t>
+        <w:t>«ON» indica que el componente está disponible. «OFF» indica que está detenido o no respondió. «Inicio parcial» significa que solamente algunos componentes están activos; en ese caso, revise el registro mostrado en la parte inferior o pulse «Abrir logs».</w:t>
       </w:r>
     </w:p>
     <w:p>
@@ -13922,12 +13421,6 @@
         <w:gridCol w:w="9458"/>
       </w:tblGrid>
       <w:tr>
-        <w:tblPrEx>
-          <w:tblCellMar>
-            <w:top w:w="0" w:type="dxa"/>
-            <w:bottom w:w="0" w:type="dxa"/>
-          </w:tblCellMar>
-        </w:tblPrEx>
         <w:tc>
           <w:tcPr>
             <w:tcW w:w="0" w:type="auto"/>
@@ -13965,15 +13458,7 @@
                 <w:sz w:val="20"/>
                 <w:szCs w:val="20"/>
               </w:rPr>
-              <w:t xml:space="preserve">No </w:t>
-            </w:r>
-            <w:r>
-              <w:rPr>
-                <w:color w:val="1A1A1A"/>
-                <w:sz w:val="20"/>
-                <w:szCs w:val="20"/>
-              </w:rPr>
-              <w:t xml:space="preserve">cierre Docker Desktop mientras </w:t>
+              <w:t xml:space="preserve">No cierre Docker Desktop mientras </w:t>
             </w:r>
             <w:proofErr w:type="spellStart"/>
             <w:r>
@@ -14087,10 +13572,7 @@
       </w:r>
       <w:proofErr w:type="spellEnd"/>
       <w:r>
-        <w:t xml:space="preserve"> con mensajes legibles. El verde </w:t>
-      </w:r>
-      <w:r>
-        <w:t>indica éxito, el amarillo una advertencia o acceso bloqueado y el rojo un error.</w:t>
+        <w:t xml:space="preserve"> con mensajes legibles. El verde indica éxito, el amarillo una advertencia o acceso bloqueado y el rojo un error.</w:t>
       </w:r>
     </w:p>
     <w:p>
@@ -14180,13 +13662,7 @@
         <w:rPr>
           <w:color w:val="1A1A1A"/>
         </w:rPr>
-        <w:t>P</w:t>
-      </w:r>
-      <w:r>
-        <w:rPr>
-          <w:color w:val="1A1A1A"/>
-        </w:rPr>
-        <w:t>rivacidad: la actividad puede mostrar nombre, rol y DNI, pero nunca almacena contraseñas, tokens, cookies, correos ni teléfonos. El panel debe ser utilizado solamente por personal autorizado.</w:t>
+        <w:t>Privacidad: la actividad puede mostrar nombre, rol y DNI, pero nunca almacena contraseñas, tokens, cookies, correos ni teléfonos. El panel debe ser utilizado solamente por personal autorizado.</w:t>
       </w:r>
     </w:p>
     <w:p>
@@ -14213,13 +13689,7 @@
         <w:rPr>
           <w:color w:val="1A1A1A"/>
         </w:rPr>
-        <w:t>Redis no es necesario para el recorrido básic</w:t>
-      </w:r>
-      <w:r>
-        <w:rPr>
-          <w:color w:val="1A1A1A"/>
-        </w:rPr>
-        <w:t>o. Para iniciarlo con Docker:</w:t>
+        <w:t>Redis no es necesario para el recorrido básico. Para iniciarlo con Docker:</w:t>
       </w:r>
     </w:p>
     <w:tbl>
@@ -14243,12 +13713,6 @@
         <w:gridCol w:w="9468"/>
       </w:tblGrid>
       <w:tr>
-        <w:tblPrEx>
-          <w:tblCellMar>
-            <w:top w:w="0" w:type="dxa"/>
-            <w:bottom w:w="0" w:type="dxa"/>
-          </w:tblCellMar>
-        </w:tblPrEx>
         <w:tc>
           <w:tcPr>
             <w:tcW w:w="0" w:type="auto"/>
@@ -14409,12 +13873,6 @@
         <w:gridCol w:w="9468"/>
       </w:tblGrid>
       <w:tr>
-        <w:tblPrEx>
-          <w:tblCellMar>
-            <w:top w:w="0" w:type="dxa"/>
-            <w:bottom w:w="0" w:type="dxa"/>
-          </w:tblCellMar>
-        </w:tblPrEx>
         <w:tc>
           <w:tcPr>
             <w:tcW w:w="0" w:type="auto"/>
@@ -14498,12 +13956,6 @@
         <w:gridCol w:w="9458"/>
       </w:tblGrid>
       <w:tr>
-        <w:tblPrEx>
-          <w:tblCellMar>
-            <w:top w:w="0" w:type="dxa"/>
-            <w:bottom w:w="0" w:type="dxa"/>
-          </w:tblCellMar>
-        </w:tblPrEx>
         <w:tc>
           <w:tcPr>
             <w:tcW w:w="0" w:type="auto"/>
@@ -14519,7 +13971,6 @@
             <w:pPr>
               <w:spacing w:after="60"/>
             </w:pPr>
-            <w:proofErr w:type="gramStart"/>
             <w:r>
               <w:rPr>
                 <w:b/>
@@ -14528,18 +13979,7 @@
                 <w:sz w:val="20"/>
                 <w:szCs w:val="20"/>
               </w:rPr>
-              <w:t>CUÁNDO</w:t>
-            </w:r>
-            <w:proofErr w:type="gramEnd"/>
-            <w:r>
-              <w:rPr>
-                <w:b/>
-                <w:bCs/>
-                <w:color w:val="2E5395"/>
-                <w:sz w:val="20"/>
-                <w:szCs w:val="20"/>
-              </w:rPr>
-              <w:t xml:space="preserve"> OMITIRLO</w:t>
+              <w:t>CUÁNDO OMITIRLO</w:t>
             </w:r>
           </w:p>
           <w:p>
@@ -14596,12 +14036,6 @@
         <w:gridCol w:w="6257"/>
       </w:tblGrid>
       <w:tr>
-        <w:tblPrEx>
-          <w:tblCellMar>
-            <w:top w:w="0" w:type="dxa"/>
-            <w:bottom w:w="0" w:type="dxa"/>
-          </w:tblCellMar>
-        </w:tblPrEx>
         <w:trPr>
           <w:tblHeader/>
         </w:trPr>
@@ -14657,12 +14091,6 @@
         </w:tc>
       </w:tr>
       <w:tr>
-        <w:tblPrEx>
-          <w:tblCellMar>
-            <w:top w:w="0" w:type="dxa"/>
-            <w:bottom w:w="0" w:type="dxa"/>
-          </w:tblCellMar>
-        </w:tblPrEx>
         <w:tc>
           <w:tcPr>
             <w:tcW w:w="1700" w:type="pct"/>
@@ -14735,12 +14163,6 @@
         </w:tc>
       </w:tr>
       <w:tr>
-        <w:tblPrEx>
-          <w:tblCellMar>
-            <w:top w:w="0" w:type="dxa"/>
-            <w:bottom w:w="0" w:type="dxa"/>
-          </w:tblCellMar>
-        </w:tblPrEx>
         <w:tc>
           <w:tcPr>
             <w:tcW w:w="1700" w:type="pct"/>
@@ -14823,12 +14245,6 @@
         </w:tc>
       </w:tr>
       <w:tr>
-        <w:tblPrEx>
-          <w:tblCellMar>
-            <w:top w:w="0" w:type="dxa"/>
-            <w:bottom w:w="0" w:type="dxa"/>
-          </w:tblCellMar>
-        </w:tblPrEx>
         <w:tc>
           <w:tcPr>
             <w:tcW w:w="1700" w:type="pct"/>
@@ -14883,12 +14299,6 @@
         </w:tc>
       </w:tr>
       <w:tr>
-        <w:tblPrEx>
-          <w:tblCellMar>
-            <w:top w:w="0" w:type="dxa"/>
-            <w:bottom w:w="0" w:type="dxa"/>
-          </w:tblCellMar>
-        </w:tblPrEx>
         <w:tc>
           <w:tcPr>
             <w:tcW w:w="1700" w:type="pct"/>
@@ -14979,12 +14389,6 @@
         </w:tc>
       </w:tr>
       <w:tr>
-        <w:tblPrEx>
-          <w:tblCellMar>
-            <w:top w:w="0" w:type="dxa"/>
-            <w:bottom w:w="0" w:type="dxa"/>
-          </w:tblCellMar>
-        </w:tblPrEx>
         <w:tc>
           <w:tcPr>
             <w:tcW w:w="1700" w:type="pct"/>
@@ -15075,12 +14479,6 @@
         </w:tc>
       </w:tr>
       <w:tr>
-        <w:tblPrEx>
-          <w:tblCellMar>
-            <w:top w:w="0" w:type="dxa"/>
-            <w:bottom w:w="0" w:type="dxa"/>
-          </w:tblCellMar>
-        </w:tblPrEx>
         <w:tc>
           <w:tcPr>
             <w:tcW w:w="1700" w:type="pct"/>
@@ -15153,12 +14551,6 @@
         </w:tc>
       </w:tr>
       <w:tr>
-        <w:tblPrEx>
-          <w:tblCellMar>
-            <w:top w:w="0" w:type="dxa"/>
-            <w:bottom w:w="0" w:type="dxa"/>
-          </w:tblCellMar>
-        </w:tblPrEx>
         <w:tc>
           <w:tcPr>
             <w:tcW w:w="1700" w:type="pct"/>
@@ -15213,12 +14605,6 @@
         </w:tc>
       </w:tr>
       <w:tr>
-        <w:tblPrEx>
-          <w:tblCellMar>
-            <w:top w:w="0" w:type="dxa"/>
-            <w:bottom w:w="0" w:type="dxa"/>
-          </w:tblCellMar>
-        </w:tblPrEx>
         <w:tc>
           <w:tcPr>
             <w:tcW w:w="1700" w:type="pct"/>
@@ -15345,12 +14731,6 @@
         </w:tc>
       </w:tr>
       <w:tr>
-        <w:tblPrEx>
-          <w:tblCellMar>
-            <w:top w:w="0" w:type="dxa"/>
-            <w:bottom w:w="0" w:type="dxa"/>
-          </w:tblCellMar>
-        </w:tblPrEx>
         <w:tc>
           <w:tcPr>
             <w:tcW w:w="1700" w:type="pct"/>
@@ -15441,12 +14821,6 @@
         <w:gridCol w:w="9468"/>
       </w:tblGrid>
       <w:tr>
-        <w:tblPrEx>
-          <w:tblCellMar>
-            <w:top w:w="0" w:type="dxa"/>
-            <w:bottom w:w="0" w:type="dxa"/>
-          </w:tblCellMar>
-        </w:tblPrEx>
         <w:tc>
           <w:tcPr>
             <w:tcW w:w="0" w:type="auto"/>
@@ -15514,17 +14888,7 @@
                 <w:szCs w:val="19"/>
                 <w:lang w:val="en-US"/>
               </w:rPr>
-              <w:t>WebRe</w:t>
-            </w:r>
-            <w:r>
-              <w:rPr>
-                <w:rFonts w:ascii="Consolas" w:eastAsia="Consolas" w:hAnsi="Consolas" w:cs="Consolas"/>
-                <w:color w:val="1A1A1A"/>
-                <w:sz w:val="19"/>
-                <w:szCs w:val="19"/>
-                <w:lang w:val="en-US"/>
-              </w:rPr>
-              <w:t>quest</w:t>
+              <w:t>WebRequest</w:t>
             </w:r>
             <w:proofErr w:type="spellEnd"/>
             <w:r>
@@ -15603,12 +14967,6 @@
         <w:gridCol w:w="9458"/>
       </w:tblGrid>
       <w:tr>
-        <w:tblPrEx>
-          <w:tblCellMar>
-            <w:top w:w="0" w:type="dxa"/>
-            <w:bottom w:w="0" w:type="dxa"/>
-          </w:tblCellMar>
-        </w:tblPrEx>
         <w:tc>
           <w:tcPr>
             <w:tcW w:w="0" w:type="auto"/>
@@ -15706,8 +15064,6 @@
       </w:r>
       <w:r>
         <w:tab/>
-      </w:r>
-      <w:r>
         <w:t xml:space="preserve">El </w:t>
       </w:r>
       <w:proofErr w:type="spellStart"/>
@@ -15836,10 +15192,7 @@
       </w:r>
       <w:r>
         <w:tab/>
-        <w:t xml:space="preserve">El administrador </w:t>
-      </w:r>
-      <w:r>
-        <w:t>puede gestionar materias, cursos y equivalencias.</w:t>
+        <w:t>El administrador puede gestionar materias, cursos y equivalencias.</w:t>
       </w:r>
     </w:p>
     <w:p>
@@ -15950,12 +15303,6 @@
         <w:gridCol w:w="6636"/>
       </w:tblGrid>
       <w:tr>
-        <w:tblPrEx>
-          <w:tblCellMar>
-            <w:top w:w="0" w:type="dxa"/>
-            <w:bottom w:w="0" w:type="dxa"/>
-          </w:tblCellMar>
-        </w:tblPrEx>
         <w:trPr>
           <w:tblHeader/>
         </w:trPr>
@@ -16011,12 +15358,6 @@
         </w:tc>
       </w:tr>
       <w:tr>
-        <w:tblPrEx>
-          <w:tblCellMar>
-            <w:top w:w="0" w:type="dxa"/>
-            <w:bottom w:w="0" w:type="dxa"/>
-          </w:tblCellMar>
-        </w:tblPrEx>
         <w:tc>
           <w:tcPr>
             <w:tcW w:w="1500" w:type="pct"/>
@@ -16073,12 +15414,6 @@
         </w:tc>
       </w:tr>
       <w:tr>
-        <w:tblPrEx>
-          <w:tblCellMar>
-            <w:top w:w="0" w:type="dxa"/>
-            <w:bottom w:w="0" w:type="dxa"/>
-          </w:tblCellMar>
-        </w:tblPrEx>
         <w:tc>
           <w:tcPr>
             <w:tcW w:w="1500" w:type="pct"/>
@@ -16135,12 +15470,6 @@
         </w:tc>
       </w:tr>
       <w:tr>
-        <w:tblPrEx>
-          <w:tblCellMar>
-            <w:top w:w="0" w:type="dxa"/>
-            <w:bottom w:w="0" w:type="dxa"/>
-          </w:tblCellMar>
-        </w:tblPrEx>
         <w:tc>
           <w:tcPr>
             <w:tcW w:w="1500" w:type="pct"/>
@@ -16231,12 +15560,6 @@
         </w:tc>
       </w:tr>
       <w:tr>
-        <w:tblPrEx>
-          <w:tblCellMar>
-            <w:top w:w="0" w:type="dxa"/>
-            <w:bottom w:w="0" w:type="dxa"/>
-          </w:tblCellMar>
-        </w:tblPrEx>
         <w:tc>
           <w:tcPr>
             <w:tcW w:w="1500" w:type="pct"/>
@@ -16309,12 +15632,6 @@
         </w:tc>
       </w:tr>
       <w:tr>
-        <w:tblPrEx>
-          <w:tblCellMar>
-            <w:top w:w="0" w:type="dxa"/>
-            <w:bottom w:w="0" w:type="dxa"/>
-          </w:tblCellMar>
-        </w:tblPrEx>
         <w:tc>
           <w:tcPr>
             <w:tcW w:w="1500" w:type="pct"/>
@@ -16369,12 +15686,6 @@
         </w:tc>
       </w:tr>
       <w:tr>
-        <w:tblPrEx>
-          <w:tblCellMar>
-            <w:top w:w="0" w:type="dxa"/>
-            <w:bottom w:w="0" w:type="dxa"/>
-          </w:tblCellMar>
-        </w:tblPrEx>
         <w:tc>
           <w:tcPr>
             <w:tcW w:w="1500" w:type="pct"/>
@@ -16429,12 +15740,6 @@
         </w:tc>
       </w:tr>
       <w:tr>
-        <w:tblPrEx>
-          <w:tblCellMar>
-            <w:top w:w="0" w:type="dxa"/>
-            <w:bottom w:w="0" w:type="dxa"/>
-          </w:tblCellMar>
-        </w:tblPrEx>
         <w:tc>
           <w:tcPr>
             <w:tcW w:w="1500" w:type="pct"/>
@@ -16517,12 +15822,6 @@
         <w:gridCol w:w="9458"/>
       </w:tblGrid>
       <w:tr>
-        <w:tblPrEx>
-          <w:tblCellMar>
-            <w:top w:w="0" w:type="dxa"/>
-            <w:bottom w:w="0" w:type="dxa"/>
-          </w:tblCellMar>
-        </w:tblPrEx>
         <w:tc>
           <w:tcPr>
             <w:tcW w:w="0" w:type="auto"/>
@@ -16568,8 +15867,8 @@
     </w:tbl>
     <w:p/>
     <w:sectPr>
-      <w:headerReference w:type="default" r:id="rId10"/>
-      <w:footerReference w:type="default" r:id="rId11"/>
+      <w:headerReference w:type="default" r:id="rId11"/>
+      <w:footerReference w:type="default" r:id="rId12"/>
       <w:pgSz w:w="11906" w:h="16838"/>
       <w:pgMar w:top="1134" w:right="1134" w:bottom="1134" w:left="1276" w:header="560" w:footer="560" w:gutter="0"/>
       <w:cols w:space="720"/>
@@ -16741,7 +16040,6 @@
         <w:szCs w:val="16"/>
       </w:rPr>
     </w:pPr>
-    <w:proofErr w:type="gramStart"/>
     <w:r>
       <w:rPr>
         <w:b/>
@@ -16758,16 +16056,7 @@
         <w:sz w:val="16"/>
         <w:szCs w:val="16"/>
       </w:rPr>
-      <w:t xml:space="preserve">  ·</w:t>
-    </w:r>
-    <w:proofErr w:type="gramEnd"/>
-    <w:r>
-      <w:rPr>
-        <w:color w:val="595959"/>
-        <w:sz w:val="16"/>
-        <w:szCs w:val="16"/>
-      </w:rPr>
-      <w:t xml:space="preserve">  Manual de </w:t>
+      <w:t xml:space="preserve">  ·  Manual de </w:t>
     </w:r>
     <w:r>
       <w:rPr>

</xml_diff>